<commit_message>
Tinjauan Pustaka Revisi 2
</commit_message>
<xml_diff>
--- a/Sempro BAB 1 Alpha.docx
+++ b/Sempro BAB 1 Alpha.docx
@@ -1,6 +1,6 @@
 
 <file path=word/document.xml><?xml version="1.0" encoding="utf-8"?>
-<w:document xmlns:wpc="http://schemas.microsoft.com/office/word/2010/wordprocessingCanvas" xmlns:cx="http://schemas.microsoft.com/office/drawing/2014/chartex" xmlns:cx1="http://schemas.microsoft.com/office/drawing/2015/9/8/chartex" xmlns:cx2="http://schemas.microsoft.com/office/drawing/2015/10/21/chartex" xmlns:cx3="http://schemas.microsoft.com/office/drawing/2016/5/9/chartex" xmlns:cx4="http://schemas.microsoft.com/office/drawing/2016/5/10/chartex" xmlns:cx5="http://schemas.microsoft.com/office/drawing/2016/5/11/chartex" xmlns:cx6="http://schemas.microsoft.com/office/drawing/2016/5/12/chartex" xmlns:cx7="http://schemas.microsoft.com/office/drawing/2016/5/13/chartex" xmlns:cx8="http://schemas.microsoft.com/office/drawing/2016/5/14/chartex" xmlns:mc="http://schemas.openxmlformats.org/markup-compatibility/2006" xmlns:aink="http://schemas.microsoft.com/office/drawing/2016/ink" xmlns:am3d="http://schemas.microsoft.com/office/drawing/2017/model3d" xmlns:o="urn:schemas-microsoft-com:office:office" xmlns:oel="http://schemas.microsoft.com/office/2019/extlst" xmlns:r="http://schemas.openxmlformats.org/officeDocument/2006/relationships" xmlns:m="http://schemas.openxmlformats.org/officeDocument/2006/math" xmlns:v="urn:schemas-microsoft-com:vml" xmlns:wp14="http://schemas.microsoft.com/office/word/2010/wordprocessingDrawing" xmlns:wp="http://schemas.openxmlformats.org/drawingml/2006/wordprocessingDrawing" xmlns:w10="urn:schemas-microsoft-com:office:word" xmlns:w="http://schemas.openxmlformats.org/wordprocessingml/2006/main" xmlns:w14="http://schemas.microsoft.com/office/word/2010/wordml" xmlns:w15="http://schemas.microsoft.com/office/word/2012/wordml" xmlns:w16cex="http://schemas.microsoft.com/office/word/2018/wordml/cex" xmlns:w16cid="http://schemas.microsoft.com/office/word/2016/wordml/cid" xmlns:w16="http://schemas.microsoft.com/office/word/2018/wordml" xmlns:w16sdtdh="http://schemas.microsoft.com/office/word/2020/wordml/sdtdatahash" xmlns:w16se="http://schemas.microsoft.com/office/word/2015/wordml/symex" xmlns:wpg="http://schemas.microsoft.com/office/word/2010/wordprocessingGroup" xmlns:wpi="http://schemas.microsoft.com/office/word/2010/wordprocessingInk" xmlns:wne="http://schemas.microsoft.com/office/word/2006/wordml" xmlns:wps="http://schemas.microsoft.com/office/word/2010/wordprocessingShape" mc:Ignorable="w14 w15 w16se w16cid w16 w16cex w16sdtdh wp14">
+<w:document xmlns:wpc="http://schemas.microsoft.com/office/word/2010/wordprocessingCanvas" xmlns:mc="http://schemas.openxmlformats.org/markup-compatibility/2006" xmlns:o="urn:schemas-microsoft-com:office:office" xmlns:r="http://schemas.openxmlformats.org/officeDocument/2006/relationships" xmlns:m="http://schemas.openxmlformats.org/officeDocument/2006/math" xmlns:v="urn:schemas-microsoft-com:vml" xmlns:wp14="http://schemas.microsoft.com/office/word/2010/wordprocessingDrawing" xmlns:wp="http://schemas.openxmlformats.org/drawingml/2006/wordprocessingDrawing" xmlns:w10="urn:schemas-microsoft-com:office:word" xmlns:w="http://schemas.openxmlformats.org/wordprocessingml/2006/main" xmlns:w14="http://schemas.microsoft.com/office/word/2010/wordml" xmlns:w15="http://schemas.microsoft.com/office/word/2012/wordml" xmlns:wpg="http://schemas.microsoft.com/office/word/2010/wordprocessingGroup" xmlns:wpi="http://schemas.microsoft.com/office/word/2010/wordprocessingInk" xmlns:wne="http://schemas.microsoft.com/office/word/2006/wordml" xmlns:wps="http://schemas.microsoft.com/office/word/2010/wordprocessingShape" mc:Ignorable="w14 w15 wp14">
   <w:body>
     <w:p>
       <w:pPr>
@@ -679,11 +679,19 @@
         </w:rPr>
         <w:t xml:space="preserve">  </w:t>
       </w:r>
-      <w:r>
-        <w:rPr>
-          <w:lang w:val="en-US"/>
-        </w:rPr>
-        <w:t xml:space="preserve">pembelajaran Topologi Jaringan berbasis </w:t>
+      <w:proofErr w:type="gramStart"/>
+      <w:r>
+        <w:rPr>
+          <w:lang w:val="en-US"/>
+        </w:rPr>
+        <w:t>pembelajaran</w:t>
+      </w:r>
+      <w:proofErr w:type="gramEnd"/>
+      <w:r>
+        <w:rPr>
+          <w:lang w:val="en-US"/>
+        </w:rPr>
+        <w:t xml:space="preserve"> Topologi Jaringan berbasis </w:t>
       </w:r>
     </w:p>
     <w:p>
@@ -999,7 +1007,21 @@
         <w:rPr>
           <w:lang w:val="en-US"/>
         </w:rPr>
-        <w:t>Sholihah Ayu Wulandari, S.ST., M.Tr.T.</w:t>
+        <w:t xml:space="preserve">Sholihah Ayu Wulandari, </w:t>
+      </w:r>
+      <w:proofErr w:type="gramStart"/>
+      <w:r>
+        <w:rPr>
+          <w:lang w:val="en-US"/>
+        </w:rPr>
+        <w:t>S.ST.,</w:t>
+      </w:r>
+      <w:proofErr w:type="gramEnd"/>
+      <w:r>
+        <w:rPr>
+          <w:lang w:val="en-US"/>
+        </w:rPr>
+        <w:t xml:space="preserve"> M.Tr.T.</w:t>
       </w:r>
       <w:r>
         <w:rPr>
@@ -1298,7 +1320,27 @@
           <w:u w:val="single"/>
           <w:lang w:val="en-US" w:eastAsia="id-ID"/>
         </w:rPr>
-        <w:t>Sholihah Ayu Wulandari, S.ST., M.Tr.T.</w:t>
+        <w:t xml:space="preserve">Sholihah Ayu Wulandari, </w:t>
+      </w:r>
+      <w:proofErr w:type="gramStart"/>
+      <w:r>
+        <w:rPr>
+          <w:rFonts w:ascii="Times New Roman" w:hAnsi="Times New Roman" w:cs="Times New Roman"/>
+          <w:sz w:val="24"/>
+          <w:u w:val="single"/>
+          <w:lang w:val="en-US" w:eastAsia="id-ID"/>
+        </w:rPr>
+        <w:t>S.ST.,</w:t>
+      </w:r>
+      <w:proofErr w:type="gramEnd"/>
+      <w:r>
+        <w:rPr>
+          <w:rFonts w:ascii="Times New Roman" w:hAnsi="Times New Roman" w:cs="Times New Roman"/>
+          <w:sz w:val="24"/>
+          <w:u w:val="single"/>
+          <w:lang w:val="en-US" w:eastAsia="id-ID"/>
+        </w:rPr>
+        <w:t xml:space="preserve"> M.Tr.T.</w:t>
       </w:r>
       <w:r>
         <w:rPr>
@@ -2620,7 +2662,19 @@
           <w:lang w:val="en-US"/>
           <w14:ligatures w14:val="none"/>
         </w:rPr>
-        <w:t xml:space="preserve"> memiliki berberapa permasalahan dilapanagan. Metode Konvensional yang masih dominan (</w:t>
+        <w:t xml:space="preserve"> memiliki berberapa permasalahan dilapanagan. Metode Konvensional yang masih dominan </w:t>
+      </w:r>
+      <w:proofErr w:type="gramStart"/>
+      <w:r>
+        <w:rPr>
+          <w:rFonts w:ascii="Times New Roman" w:eastAsia="Times New Roman" w:hAnsi="Times New Roman" w:cs="Times New Roman"/>
+          <w:kern w:val="0"/>
+          <w:sz w:val="24"/>
+          <w:szCs w:val="24"/>
+          <w:lang w:val="en-US"/>
+          <w14:ligatures w14:val="none"/>
+        </w:rPr>
+        <w:t>(</w:t>
       </w:r>
       <w:r>
         <w:rPr>
@@ -2642,7 +2696,19 @@
           <w:lang w:val="en-US"/>
           <w14:ligatures w14:val="none"/>
         </w:rPr>
-        <w:t xml:space="preserve">pembelajaran secara verbal, gambar statis, dan video) cenderung membuat mahasiswa kesulitan dalam memahami materi topologi jaringan. Penelitian yang dilakukan oleh </w:t>
+        <w:t>pembelajaran</w:t>
+      </w:r>
+      <w:proofErr w:type="gramEnd"/>
+      <w:r>
+        <w:rPr>
+          <w:rFonts w:ascii="Times New Roman" w:eastAsia="Times New Roman" w:hAnsi="Times New Roman" w:cs="Times New Roman"/>
+          <w:kern w:val="0"/>
+          <w:sz w:val="24"/>
+          <w:szCs w:val="24"/>
+          <w:lang w:val="en-US"/>
+          <w14:ligatures w14:val="none"/>
+        </w:rPr>
+        <w:t xml:space="preserve"> secara verbal, gambar statis, dan video) cenderung membuat mahasiswa kesulitan dalam memahami materi topologi jaringan. Penelitian yang dilakukan oleh </w:t>
       </w:r>
       <w:r>
         <w:rPr>
@@ -2686,7 +2752,31 @@
           <w:lang w:val="en-US"/>
           <w14:ligatures w14:val="none"/>
         </w:rPr>
-        <w:t>. Hasil pre-test yang dilakukan menunjukkan rata-rata skor sebesar 58,8, yang mengindikasikan bahwa pemahaman awal mahasiswa terhadap materi tersebut masih tergolong rendah.</w:t>
+        <w:t>. Hasil pre-test yang dilakukan menunjukkan rata-rata skor sebesar 58</w:t>
+      </w:r>
+      <w:proofErr w:type="gramStart"/>
+      <w:r>
+        <w:rPr>
+          <w:rFonts w:ascii="Times New Roman" w:eastAsia="Times New Roman" w:hAnsi="Times New Roman" w:cs="Times New Roman"/>
+          <w:kern w:val="0"/>
+          <w:sz w:val="24"/>
+          <w:szCs w:val="24"/>
+          <w:lang w:val="en-US"/>
+          <w14:ligatures w14:val="none"/>
+        </w:rPr>
+        <w:t>,8</w:t>
+      </w:r>
+      <w:proofErr w:type="gramEnd"/>
+      <w:r>
+        <w:rPr>
+          <w:rFonts w:ascii="Times New Roman" w:eastAsia="Times New Roman" w:hAnsi="Times New Roman" w:cs="Times New Roman"/>
+          <w:kern w:val="0"/>
+          <w:sz w:val="24"/>
+          <w:szCs w:val="24"/>
+          <w:lang w:val="en-US"/>
+          <w14:ligatures w14:val="none"/>
+        </w:rPr>
+        <w:t>, yang mengindikasikan bahwa pemahaman awal mahasiswa terhadap materi tersebut masih tergolong rendah.</w:t>
       </w:r>
       <w:r>
         <w:rPr>
@@ -2880,7 +2970,31 @@
           <w:lang w:val="en-US"/>
           <w14:ligatures w14:val="none"/>
         </w:rPr>
-        <w:t>erancang simulasi topologi jaringan berbasis AR menggunakan Unity 3D dan Vuforia; hasil uji coba menunjukkan peningkatan skor pemahaman mahasiswa dari rata-rata pretest 58,8 menjadi 80,6 pada posttest</w:t>
+        <w:t>erancang simulasi topologi jaringan berbasis AR menggunakan Unity 3D dan Vuforia; hasil uji coba menunjukkan peningkatan skor pemahaman mahasiswa dari rata-rata pretest 58</w:t>
+      </w:r>
+      <w:proofErr w:type="gramStart"/>
+      <w:r>
+        <w:rPr>
+          <w:rFonts w:ascii="Times New Roman" w:eastAsia="Times New Roman" w:hAnsi="Times New Roman" w:cs="Times New Roman"/>
+          <w:kern w:val="0"/>
+          <w:sz w:val="24"/>
+          <w:szCs w:val="24"/>
+          <w:lang w:val="en-US"/>
+          <w14:ligatures w14:val="none"/>
+        </w:rPr>
+        <w:t>,8</w:t>
+      </w:r>
+      <w:proofErr w:type="gramEnd"/>
+      <w:r>
+        <w:rPr>
+          <w:rFonts w:ascii="Times New Roman" w:eastAsia="Times New Roman" w:hAnsi="Times New Roman" w:cs="Times New Roman"/>
+          <w:kern w:val="0"/>
+          <w:sz w:val="24"/>
+          <w:szCs w:val="24"/>
+          <w:lang w:val="en-US"/>
+          <w14:ligatures w14:val="none"/>
+        </w:rPr>
+        <w:t xml:space="preserve"> menjadi 80,6 pada posttest</w:t>
       </w:r>
       <w:sdt>
         <w:sdtPr>
@@ -3414,7 +3528,31 @@
           <w:lang w:val="en-US"/>
           <w14:ligatures w14:val="none"/>
         </w:rPr>
-        <w:t xml:space="preserve">, mudah diintegrasikan dengan kurikulum berbasis buku, serta mendukung berbagai gaya belajar. Dengan demikian, Magic Book berbasis AR diharapkan dapat meningkatkan pemahaman mendalam, motivasi, dan hasil belajar </w:t>
+        <w:t xml:space="preserve">, mudah diintegrasikan dengan kurikulum berbasis buku, serta mendukung berbagai </w:t>
+      </w:r>
+      <w:proofErr w:type="gramStart"/>
+      <w:r>
+        <w:rPr>
+          <w:rFonts w:ascii="Times New Roman" w:eastAsia="Times New Roman" w:hAnsi="Times New Roman" w:cs="Times New Roman"/>
+          <w:kern w:val="0"/>
+          <w:sz w:val="24"/>
+          <w:szCs w:val="24"/>
+          <w:lang w:val="en-US"/>
+          <w14:ligatures w14:val="none"/>
+        </w:rPr>
+        <w:t>gaya</w:t>
+      </w:r>
+      <w:proofErr w:type="gramEnd"/>
+      <w:r>
+        <w:rPr>
+          <w:rFonts w:ascii="Times New Roman" w:eastAsia="Times New Roman" w:hAnsi="Times New Roman" w:cs="Times New Roman"/>
+          <w:kern w:val="0"/>
+          <w:sz w:val="24"/>
+          <w:szCs w:val="24"/>
+          <w:lang w:val="en-US"/>
+          <w14:ligatures w14:val="none"/>
+        </w:rPr>
+        <w:t xml:space="preserve"> belajar. Dengan demikian, Magic Book berbasis AR diharapkan dapat meningkatkan pemahaman mendalam, motivasi, dan hasil belajar </w:t>
       </w:r>
       <w:r>
         <w:rPr>
@@ -3807,6 +3945,283 @@
       <w:bookmarkEnd w:id="9"/>
       <w:bookmarkEnd w:id="10"/>
       <w:bookmarkEnd w:id="11"/>
+    </w:p>
+    <w:p>
+      <w:pPr>
+        <w:pStyle w:val="Heading2"/>
+        <w:rPr>
+          <w:lang w:val="en-US" w:eastAsia="id-ID"/>
+        </w:rPr>
+      </w:pPr>
+      <w:r>
+        <w:rPr>
+          <w:lang w:val="en-US" w:eastAsia="id-ID"/>
+        </w:rPr>
+        <w:t>Media Pembelajaran</w:t>
+      </w:r>
+    </w:p>
+    <w:p>
+      <w:pPr>
+        <w:spacing w:line="360" w:lineRule="auto"/>
+        <w:ind w:firstLine="720"/>
+        <w:jc w:val="both"/>
+        <w:rPr>
+          <w:rFonts w:ascii="Times New Roman" w:hAnsi="Times New Roman" w:cs="Times New Roman"/>
+          <w:sz w:val="24"/>
+          <w:szCs w:val="24"/>
+          <w:lang w:val="en-US" w:eastAsia="id-ID"/>
+        </w:rPr>
+      </w:pPr>
+      <w:r>
+        <w:rPr>
+          <w:rFonts w:ascii="Times New Roman" w:hAnsi="Times New Roman" w:cs="Times New Roman"/>
+          <w:sz w:val="24"/>
+          <w:szCs w:val="24"/>
+          <w:lang w:val="en-US" w:eastAsia="id-ID"/>
+        </w:rPr>
+        <w:t xml:space="preserve">Media pembelajaran merupakan komponen esensial dalam proses pendidikan yang berperan sebagai perantara untuk menyampaikan pesan, informasi, atau materi pembelajaran dari sumber belajar kepada peserta didik. Media pembelajaran tidak hanya berfungsi sebagai alat </w:t>
+      </w:r>
+      <w:proofErr w:type="gramStart"/>
+      <w:r>
+        <w:rPr>
+          <w:rFonts w:ascii="Times New Roman" w:hAnsi="Times New Roman" w:cs="Times New Roman"/>
+          <w:sz w:val="24"/>
+          <w:szCs w:val="24"/>
+          <w:lang w:val="en-US" w:eastAsia="id-ID"/>
+        </w:rPr>
+        <w:t>bantu</w:t>
+      </w:r>
+      <w:proofErr w:type="gramEnd"/>
+      <w:r>
+        <w:rPr>
+          <w:rFonts w:ascii="Times New Roman" w:hAnsi="Times New Roman" w:cs="Times New Roman"/>
+          <w:sz w:val="24"/>
+          <w:szCs w:val="24"/>
+          <w:lang w:val="en-US" w:eastAsia="id-ID"/>
+        </w:rPr>
+        <w:t>, tetapi juga sebagai sarana yang dapat merangsang minat, perhatian, dan motivasi belajar peserta didik sehingga proses pembelajaran menjadi lebih efektif dan bermakna. Dalam konteks pendidikan vokasi di perguruan tinggi, khususnya pada mata kuliah yang bersifat teknis dan konseptual seperti topologi jaringan, keberadaan media pembelajaran yang tepat sangat diperlukan untuk membantu mahasiswa memahami konsep abstrak yang sulit divisualisasikan hanya melalui metode ceramah atau buku teks konvensional.</w:t>
+      </w:r>
+    </w:p>
+    <w:p>
+      <w:pPr>
+        <w:spacing w:line="360" w:lineRule="auto"/>
+        <w:ind w:firstLine="720"/>
+        <w:jc w:val="both"/>
+        <w:rPr>
+          <w:rFonts w:ascii="Times New Roman" w:hAnsi="Times New Roman" w:cs="Times New Roman"/>
+          <w:sz w:val="24"/>
+          <w:szCs w:val="24"/>
+          <w:lang w:val="en-US" w:eastAsia="id-ID"/>
+        </w:rPr>
+      </w:pPr>
+      <w:r>
+        <w:rPr>
+          <w:rFonts w:ascii="Times New Roman" w:hAnsi="Times New Roman" w:cs="Times New Roman"/>
+          <w:sz w:val="24"/>
+          <w:szCs w:val="24"/>
+          <w:lang w:val="en-US" w:eastAsia="id-ID"/>
+        </w:rPr>
+        <w:t>Menurut Harsiwi dan Arini (2020), penggunaan media pembelajaran interaktif secara signifikan berpengaruh positif terhadap peningkatan hasil belajar siswa di sekolah dasar. Penelitian mereka menunjukkan bahwa media interaktif mampu meningkatkan pemahaman konsep dan keterlibatan peserta didik dibandingkan dengan pembelajaran konvensional. Temuan ini relevan dengan kebutuhan pembelajaran di tingkat perguruan tinggi vokasi, di mana mahasiswa memerlukan media yang tidak hanya informatif tetapi juga interaktif untuk membangun pemahaman mendalam terhadap materi teknis.</w:t>
+      </w:r>
+    </w:p>
+    <w:p>
+      <w:pPr>
+        <w:spacing w:before="100" w:beforeAutospacing="1" w:after="100" w:afterAutospacing="1" w:line="360" w:lineRule="auto"/>
+        <w:ind w:firstLine="720"/>
+        <w:jc w:val="both"/>
+        <w:rPr>
+          <w:rFonts w:ascii="Times New Roman" w:eastAsia="Times New Roman" w:hAnsi="Times New Roman" w:cs="Times New Roman"/>
+          <w:kern w:val="0"/>
+          <w:sz w:val="24"/>
+          <w:szCs w:val="24"/>
+          <w:lang w:val="en-US"/>
+          <w14:ligatures w14:val="none"/>
+        </w:rPr>
+      </w:pPr>
+      <w:r>
+        <w:rPr>
+          <w:rFonts w:ascii="Times New Roman" w:eastAsia="Times New Roman" w:hAnsi="Times New Roman" w:cs="Times New Roman"/>
+          <w:kern w:val="0"/>
+          <w:sz w:val="24"/>
+          <w:szCs w:val="24"/>
+          <w:lang w:val="en-US"/>
+          <w14:ligatures w14:val="none"/>
+        </w:rPr>
+        <w:t xml:space="preserve">Jenis media pembelajaran terus berkembang seiring kemajuan teknologi. Saat ini, media digital interaktif, multimedia, dan berbasis </w:t>
+      </w:r>
+      <w:r>
+        <w:rPr>
+          <w:rFonts w:ascii="Times New Roman" w:eastAsia="Times New Roman" w:hAnsi="Times New Roman" w:cs="Times New Roman"/>
+          <w:i/>
+          <w:iCs/>
+          <w:kern w:val="0"/>
+          <w:sz w:val="24"/>
+          <w:szCs w:val="24"/>
+          <w:lang w:val="en-US"/>
+          <w14:ligatures w14:val="none"/>
+        </w:rPr>
+        <w:t>Augmented Reality</w:t>
+      </w:r>
+      <w:r>
+        <w:rPr>
+          <w:rFonts w:ascii="Times New Roman" w:eastAsia="Times New Roman" w:hAnsi="Times New Roman" w:cs="Times New Roman"/>
+          <w:kern w:val="0"/>
+          <w:sz w:val="24"/>
+          <w:szCs w:val="24"/>
+          <w:lang w:val="en-US"/>
+          <w14:ligatures w14:val="none"/>
+        </w:rPr>
+        <w:t xml:space="preserve"> (AR) semakin banyak dikembangkan dan digunakan karena mampu menyajikan materi secara lebih menarik, dinamis, dan kontekstual. Penelitian Gusniawati, Yohanie, dan Darsono (2025) mengembangkan media pembelajaran interaktif berbasis Android dan membuktikan bahwa media tersebut layak digunakan serta mampu mendukung proses pembelajaran yang lebih inovatif. Demikian pula, Yuliana, Firmansyah, dan Pratita (2024) mengeksplorasi media interaktif berbasis </w:t>
+      </w:r>
+      <w:r>
+        <w:rPr>
+          <w:rFonts w:ascii="Times New Roman" w:eastAsia="Times New Roman" w:hAnsi="Times New Roman" w:cs="Times New Roman"/>
+          <w:i/>
+          <w:iCs/>
+          <w:kern w:val="0"/>
+          <w:sz w:val="24"/>
+          <w:szCs w:val="24"/>
+          <w:lang w:val="en-US"/>
+          <w14:ligatures w14:val="none"/>
+        </w:rPr>
+        <w:lastRenderedPageBreak/>
+        <w:t>Liveworksheets</w:t>
+      </w:r>
+      <w:r>
+        <w:rPr>
+          <w:rFonts w:ascii="Times New Roman" w:eastAsia="Times New Roman" w:hAnsi="Times New Roman" w:cs="Times New Roman"/>
+          <w:kern w:val="0"/>
+          <w:sz w:val="24"/>
+          <w:szCs w:val="24"/>
+          <w:lang w:val="en-US"/>
+          <w14:ligatures w14:val="none"/>
+        </w:rPr>
+        <w:t xml:space="preserve"> dengan pendekatan </w:t>
+      </w:r>
+      <w:r>
+        <w:rPr>
+          <w:rFonts w:ascii="Times New Roman" w:eastAsia="Times New Roman" w:hAnsi="Times New Roman" w:cs="Times New Roman"/>
+          <w:i/>
+          <w:iCs/>
+          <w:kern w:val="0"/>
+          <w:sz w:val="24"/>
+          <w:szCs w:val="24"/>
+          <w:lang w:val="en-US"/>
+          <w14:ligatures w14:val="none"/>
+        </w:rPr>
+        <w:t>case-based learning</w:t>
+      </w:r>
+      <w:r>
+        <w:rPr>
+          <w:rFonts w:ascii="Times New Roman" w:eastAsia="Times New Roman" w:hAnsi="Times New Roman" w:cs="Times New Roman"/>
+          <w:kern w:val="0"/>
+          <w:sz w:val="24"/>
+          <w:szCs w:val="24"/>
+          <w:lang w:val="en-US"/>
+          <w14:ligatures w14:val="none"/>
+        </w:rPr>
+        <w:t xml:space="preserve"> yang terbukti dapat meningkatkan keterlibatan dan pemahaman mahasiswa.</w:t>
+      </w:r>
+    </w:p>
+    <w:p>
+      <w:pPr>
+        <w:spacing w:before="100" w:beforeAutospacing="1" w:after="100" w:afterAutospacing="1" w:line="360" w:lineRule="auto"/>
+        <w:ind w:firstLine="720"/>
+        <w:jc w:val="both"/>
+        <w:rPr>
+          <w:rFonts w:ascii="Times New Roman" w:eastAsia="Times New Roman" w:hAnsi="Times New Roman" w:cs="Times New Roman"/>
+          <w:kern w:val="0"/>
+          <w:sz w:val="24"/>
+          <w:szCs w:val="24"/>
+          <w:lang w:val="en-US"/>
+          <w14:ligatures w14:val="none"/>
+        </w:rPr>
+      </w:pPr>
+      <w:r>
+        <w:rPr>
+          <w:rFonts w:ascii="Times New Roman" w:eastAsia="Times New Roman" w:hAnsi="Times New Roman" w:cs="Times New Roman"/>
+          <w:kern w:val="0"/>
+          <w:sz w:val="24"/>
+          <w:szCs w:val="24"/>
+          <w:lang w:val="en-US"/>
+          <w14:ligatures w14:val="none"/>
+        </w:rPr>
+        <w:t>Penggunaan media pembelajaran berbasis teknologi, khususnya yang interaktif dan visual, menjadi solusi strategis untuk mengatasi tantangan pembelajaran topologi jaringan yang bersifat abstrak dan memerlukan pemahaman spasial serta relasional antar komponen jaringan. Media semacam ini sejalan dengan prinsip pembelajaran abad ke-21 yang menekankan pada keterlibatan aktif, kolaborasi, dan pemanfaatan teknologi digital.</w:t>
+      </w:r>
+    </w:p>
+    <w:p>
+      <w:pPr>
+        <w:spacing w:before="100" w:beforeAutospacing="1" w:after="100" w:afterAutospacing="1" w:line="360" w:lineRule="auto"/>
+        <w:ind w:firstLine="720"/>
+        <w:jc w:val="both"/>
+        <w:rPr>
+          <w:rFonts w:ascii="Times New Roman" w:eastAsia="Times New Roman" w:hAnsi="Times New Roman" w:cs="Times New Roman"/>
+          <w:kern w:val="0"/>
+          <w:sz w:val="24"/>
+          <w:szCs w:val="24"/>
+          <w:lang w:val="en-US"/>
+          <w14:ligatures w14:val="none"/>
+        </w:rPr>
+      </w:pPr>
+      <w:r>
+        <w:rPr>
+          <w:rFonts w:ascii="Times New Roman" w:eastAsia="Times New Roman" w:hAnsi="Times New Roman" w:cs="Times New Roman"/>
+          <w:kern w:val="0"/>
+          <w:sz w:val="24"/>
+          <w:szCs w:val="24"/>
+          <w:lang w:val="en-US"/>
+          <w14:ligatures w14:val="none"/>
+        </w:rPr>
+        <w:t xml:space="preserve">Dengan demikian, pengembangan media pembelajaran inovatif seperti </w:t>
+      </w:r>
+      <w:r>
+        <w:rPr>
+          <w:rFonts w:ascii="Times New Roman" w:eastAsia="Times New Roman" w:hAnsi="Times New Roman" w:cs="Times New Roman"/>
+          <w:i/>
+          <w:iCs/>
+          <w:kern w:val="0"/>
+          <w:sz w:val="24"/>
+          <w:szCs w:val="24"/>
+          <w:lang w:val="en-US"/>
+          <w14:ligatures w14:val="none"/>
+        </w:rPr>
+        <w:t>Magic Book</w:t>
+      </w:r>
+      <w:r>
+        <w:rPr>
+          <w:rFonts w:ascii="Times New Roman" w:eastAsia="Times New Roman" w:hAnsi="Times New Roman" w:cs="Times New Roman"/>
+          <w:kern w:val="0"/>
+          <w:sz w:val="24"/>
+          <w:szCs w:val="24"/>
+          <w:lang w:val="en-US"/>
+          <w14:ligatures w14:val="none"/>
+        </w:rPr>
+        <w:t xml:space="preserve"> berbasis </w:t>
+      </w:r>
+      <w:r>
+        <w:rPr>
+          <w:rFonts w:ascii="Times New Roman" w:eastAsia="Times New Roman" w:hAnsi="Times New Roman" w:cs="Times New Roman"/>
+          <w:i/>
+          <w:iCs/>
+          <w:kern w:val="0"/>
+          <w:sz w:val="24"/>
+          <w:szCs w:val="24"/>
+          <w:lang w:val="en-US"/>
+          <w14:ligatures w14:val="none"/>
+        </w:rPr>
+        <w:t>Augmented Reality</w:t>
+      </w:r>
+      <w:r>
+        <w:rPr>
+          <w:rFonts w:ascii="Times New Roman" w:eastAsia="Times New Roman" w:hAnsi="Times New Roman" w:cs="Times New Roman"/>
+          <w:kern w:val="0"/>
+          <w:sz w:val="24"/>
+          <w:szCs w:val="24"/>
+          <w:lang w:val="en-US"/>
+          <w14:ligatures w14:val="none"/>
+        </w:rPr>
+        <w:t xml:space="preserve"> merupakan langkah yang tepat untuk meningkatkan kualitas pembelajaran topologi jaringan di lingkungan pendidikan vokasi.</w:t>
+      </w:r>
     </w:p>
     <w:p>
       <w:pPr>
@@ -3905,38 +4320,46 @@
           <w:szCs w:val="24"/>
           <w:lang w:val="en-US"/>
         </w:rPr>
-        <w:t xml:space="preserve"> Media interaktif Magic Book ini tidak sekedar menarik secara vsual, melainkan juga dirancang untuk mengembangkan potensi kognitif, merangsang kemampuan berekspresi, sekaligus melatih sensori motorik </w:t>
-      </w:r>
-      <w:sdt>
-        <w:sdtPr>
-          <w:rPr>
-            <w:rFonts w:ascii="Calibri" w:hAnsi="Calibri" w:cs="Calibri"/>
-            <w:color w:val="000000"/>
-            <w:szCs w:val="24"/>
-            <w:lang w:val="en-US"/>
-          </w:rPr>
-          <w:tag w:val="MENDELEY_CITATION_v3_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"/>
-          <w:id w:val="-685290899"/>
-          <w:placeholder>
-            <w:docPart w:val="DefaultPlaceholder_-1854013440"/>
-          </w:placeholder>
-        </w:sdtPr>
-        <w:sdtEndPr>
-          <w:rPr>
-            <w:szCs w:val="22"/>
-            <w:lang w:val="id-ID"/>
-          </w:rPr>
-        </w:sdtEndPr>
-        <w:sdtContent>
-          <w:r>
-            <w:rPr>
-              <w:rFonts w:ascii="Calibri" w:hAnsi="Calibri" w:cs="Calibri"/>
-              <w:color w:val="000000"/>
-            </w:rPr>
-            <w:t>(Ristasari, 2023)</w:t>
-          </w:r>
-        </w:sdtContent>
-      </w:sdt>
+        <w:t xml:space="preserve"> </w:t>
+      </w:r>
+      <w:r>
+        <w:rPr>
+          <w:rFonts w:ascii="Times New Roman" w:hAnsi="Times New Roman" w:cs="Times New Roman"/>
+          <w:sz w:val="24"/>
+          <w:szCs w:val="24"/>
+          <w:lang w:val="en-US"/>
+        </w:rPr>
+        <w:t xml:space="preserve">Magic Book bekerja dengan menempatkan marker pada setiap halaman buku yang kemudian dideteksi oleh aplikasi AR pada perangkat mobile. Melalui kamera, marker tersebut </w:t>
+      </w:r>
+      <w:proofErr w:type="gramStart"/>
+      <w:r>
+        <w:rPr>
+          <w:rFonts w:ascii="Times New Roman" w:hAnsi="Times New Roman" w:cs="Times New Roman"/>
+          <w:sz w:val="24"/>
+          <w:szCs w:val="24"/>
+          <w:lang w:val="en-US"/>
+        </w:rPr>
+        <w:t>akan</w:t>
+      </w:r>
+      <w:proofErr w:type="gramEnd"/>
+      <w:r>
+        <w:rPr>
+          <w:rFonts w:ascii="Times New Roman" w:hAnsi="Times New Roman" w:cs="Times New Roman"/>
+          <w:sz w:val="24"/>
+          <w:szCs w:val="24"/>
+          <w:lang w:val="en-US"/>
+        </w:rPr>
+        <w:t xml:space="preserve"> menampilkan objek virtual berupa model 3D, animasi, teks, suara, atau video yang tumpang tindih (overlay) dengan dunia nyata</w:t>
+      </w:r>
+      <w:r>
+        <w:rPr>
+          <w:rFonts w:ascii="Times New Roman" w:hAnsi="Times New Roman" w:cs="Times New Roman"/>
+          <w:sz w:val="24"/>
+          <w:szCs w:val="24"/>
+          <w:lang w:val="en-US"/>
+        </w:rPr>
+        <w:t xml:space="preserve"> ()</w:t>
+      </w:r>
       <w:r>
         <w:rPr>
           <w:rFonts w:ascii="Times New Roman" w:hAnsi="Times New Roman" w:cs="Times New Roman"/>
@@ -3946,6 +4369,126 @@
         </w:rPr>
         <w:t>.</w:t>
       </w:r>
+    </w:p>
+    <w:p>
+      <w:pPr>
+        <w:spacing w:line="360" w:lineRule="auto"/>
+        <w:ind w:firstLine="720"/>
+        <w:jc w:val="both"/>
+        <w:rPr>
+          <w:rFonts w:ascii="Times New Roman" w:hAnsi="Times New Roman" w:cs="Times New Roman"/>
+          <w:sz w:val="24"/>
+          <w:szCs w:val="24"/>
+          <w:lang w:val="en-US"/>
+        </w:rPr>
+      </w:pPr>
+      <w:r>
+        <w:rPr>
+          <w:rFonts w:ascii="Times New Roman" w:hAnsi="Times New Roman" w:cs="Times New Roman"/>
+          <w:sz w:val="24"/>
+          <w:szCs w:val="24"/>
+          <w:lang w:val="en-US"/>
+        </w:rPr>
+        <w:t xml:space="preserve">Menurut Buchori (2020), Magic Book berbasis AR adalah buku teks yang mampu menampilkan konten augmented reality sehingga menjadi lebih menarik bagi peserta didik. Magic Book tidak hanya berfungsi sebagai media gambar statis, melainkan sebagai transitional interface yang memungkinkan pengguna </w:t>
+      </w:r>
+      <w:r>
+        <w:rPr>
+          <w:rFonts w:ascii="Times New Roman" w:hAnsi="Times New Roman" w:cs="Times New Roman"/>
+          <w:sz w:val="24"/>
+          <w:szCs w:val="24"/>
+          <w:lang w:val="en-US"/>
+        </w:rPr>
+        <w:lastRenderedPageBreak/>
+        <w:t xml:space="preserve">berinteraksi secara seamless antara dunia nyata dan virtual. Pengguna dapat membalik halaman buku secara fisik seperti buku biasa, namun ketika dilihat melalui perangkat AR, objek 3D </w:t>
+      </w:r>
+      <w:proofErr w:type="gramStart"/>
+      <w:r>
+        <w:rPr>
+          <w:rFonts w:ascii="Times New Roman" w:hAnsi="Times New Roman" w:cs="Times New Roman"/>
+          <w:sz w:val="24"/>
+          <w:szCs w:val="24"/>
+          <w:lang w:val="en-US"/>
+        </w:rPr>
+        <w:t>akan</w:t>
+      </w:r>
+      <w:proofErr w:type="gramEnd"/>
+      <w:r>
+        <w:rPr>
+          <w:rFonts w:ascii="Times New Roman" w:hAnsi="Times New Roman" w:cs="Times New Roman"/>
+          <w:sz w:val="24"/>
+          <w:szCs w:val="24"/>
+          <w:lang w:val="en-US"/>
+        </w:rPr>
+        <w:t xml:space="preserve"> muncul dan dapat dimanipulasi.</w:t>
+      </w:r>
+    </w:p>
+    <w:p>
+      <w:pPr>
+        <w:spacing w:line="360" w:lineRule="auto"/>
+        <w:ind w:firstLine="720"/>
+        <w:jc w:val="both"/>
+        <w:rPr>
+          <w:rFonts w:ascii="Times New Roman" w:hAnsi="Times New Roman" w:cs="Times New Roman"/>
+          <w:sz w:val="24"/>
+          <w:szCs w:val="24"/>
+          <w:lang w:val="en-US"/>
+        </w:rPr>
+      </w:pPr>
+      <w:r>
+        <w:rPr>
+          <w:rFonts w:ascii="Times New Roman" w:hAnsi="Times New Roman" w:cs="Times New Roman"/>
+          <w:sz w:val="24"/>
+          <w:szCs w:val="24"/>
+          <w:lang w:val="en-US"/>
+        </w:rPr>
+        <w:t>Beberapa penelitian sebelumnya telah membuktikan efektivitas Magic Book berbasis AR. Setiawan (2021) mengembangkan Magic Book AR untuk materi pengenalan perangkat keras komputer dan memperoleh hasil validasi ahli media dan materi yang sangat layak (0,89 dan 0,94). Penelitian serupa juga menunjukkan bahwa media ini mampu meningkatkan motivasi, minat belajar, serta pemahaman konsep peserta didik.</w:t>
+      </w:r>
+    </w:p>
+    <w:p>
+      <w:pPr>
+        <w:spacing w:line="360" w:lineRule="auto"/>
+        <w:ind w:firstLine="720"/>
+        <w:jc w:val="both"/>
+        <w:rPr>
+          <w:rFonts w:ascii="Times New Roman" w:hAnsi="Times New Roman" w:cs="Times New Roman"/>
+          <w:sz w:val="24"/>
+          <w:szCs w:val="24"/>
+          <w:lang w:val="en-US"/>
+        </w:rPr>
+      </w:pPr>
+      <w:r>
+        <w:rPr>
+          <w:rFonts w:ascii="Times New Roman" w:hAnsi="Times New Roman" w:cs="Times New Roman"/>
+          <w:sz w:val="24"/>
+          <w:szCs w:val="24"/>
+          <w:lang w:val="en-US"/>
+        </w:rPr>
+        <w:t>Dibandingkan dengan media pembelajaran konvensional, Magic Book berbasis AR memiliki keunggulan antara lain: (1) peningkatan visualisasi 3D, (2) interaksi real-time, (3) daya tarik yang tinggi sehingga mengurangi kebosanan, dan (4) fleksibilitas sebagai media portabel yang dapat digunakan secara mandiri oleh mahasiswa.</w:t>
+      </w:r>
+    </w:p>
+    <w:p>
+      <w:pPr>
+        <w:spacing w:line="360" w:lineRule="auto"/>
+        <w:ind w:firstLine="720"/>
+        <w:jc w:val="both"/>
+        <w:rPr>
+          <w:rFonts w:ascii="Times New Roman" w:hAnsi="Times New Roman" w:cs="Times New Roman"/>
+          <w:sz w:val="24"/>
+          <w:szCs w:val="24"/>
+          <w:lang w:val="en-US"/>
+        </w:rPr>
+      </w:pPr>
+      <w:r>
+        <w:rPr>
+          <w:rFonts w:ascii="Times New Roman" w:hAnsi="Times New Roman" w:cs="Times New Roman"/>
+          <w:sz w:val="24"/>
+          <w:szCs w:val="24"/>
+          <w:lang w:val="en-US"/>
+        </w:rPr>
+        <w:t>Dengan demikian, pengembangan Magic Book berbasis AR pada mata kuliah Topologi Jaringan di Politeknik Negeri Jember PSDKU Sidoarjo diharapkan dapat menjadi solusi inovatif untuk meningkatkan kualitas pembelajaran vokasi.</w:t>
+      </w:r>
+      <w:bookmarkStart w:id="12" w:name="_GoBack"/>
+      <w:bookmarkEnd w:id="12"/>
     </w:p>
     <w:p>
       <w:pPr>
@@ -4148,6 +4691,35 @@
     </w:p>
     <w:p>
       <w:pPr>
+        <w:pStyle w:val="Heading3"/>
+      </w:pPr>
+      <w:r>
+        <w:t>Marker Based Augmented Reality</w:t>
+      </w:r>
+    </w:p>
+    <w:p>
+      <w:pPr>
+        <w:ind w:left="720" w:hanging="720"/>
+        <w:rPr>
+          <w:lang w:val="en-US" w:eastAsia="id-ID"/>
+        </w:rPr>
+      </w:pPr>
+    </w:p>
+    <w:p>
+      <w:pPr>
+        <w:spacing w:line="360" w:lineRule="auto"/>
+        <w:jc w:val="both"/>
+        <w:rPr>
+          <w:rFonts w:ascii="Times New Roman" w:eastAsiaTheme="majorEastAsia" w:hAnsi="Times New Roman" w:cstheme="majorBidi"/>
+          <w:color w:val="000000" w:themeColor="text1"/>
+          <w:sz w:val="24"/>
+          <w:szCs w:val="40"/>
+          <w:lang w:val="en-US" w:eastAsia="id-ID"/>
+        </w:rPr>
+      </w:pPr>
+    </w:p>
+    <w:p>
+      <w:pPr>
         <w:pStyle w:val="Heading2"/>
         <w:rPr>
           <w:lang w:val="en-US" w:eastAsia="id-ID"/>
@@ -4157,6 +4729,7 @@
         <w:rPr>
           <w:lang w:val="en-US" w:eastAsia="id-ID"/>
         </w:rPr>
+        <w:lastRenderedPageBreak/>
         <w:t>Topologi Jaringan Komputer</w:t>
       </w:r>
     </w:p>
@@ -4255,7 +4828,31 @@
           <w:lang w:val="en-ID" w:eastAsia="en-ID"/>
           <w14:ligatures w14:val="none"/>
         </w:rPr>
-        <w:t xml:space="preserve">) terhubung satu sama lain dalam sebuah sistem untuk berkomunikasi. Secara operasional, jenis topologi yang diterapkan secara langsung berpengaruh terhadap kinerja dan performa pertukaran data secara keseluruhan. Menurut </w:t>
+        <w:t xml:space="preserve">) terhubung satu </w:t>
+      </w:r>
+      <w:proofErr w:type="gramStart"/>
+      <w:r>
+        <w:rPr>
+          <w:rFonts w:ascii="Times New Roman" w:eastAsia="Times New Roman" w:hAnsi="Times New Roman" w:cs="Times New Roman"/>
+          <w:kern w:val="0"/>
+          <w:sz w:val="24"/>
+          <w:szCs w:val="24"/>
+          <w:lang w:val="en-ID" w:eastAsia="en-ID"/>
+          <w14:ligatures w14:val="none"/>
+        </w:rPr>
+        <w:t>sama</w:t>
+      </w:r>
+      <w:proofErr w:type="gramEnd"/>
+      <w:r>
+        <w:rPr>
+          <w:rFonts w:ascii="Times New Roman" w:eastAsia="Times New Roman" w:hAnsi="Times New Roman" w:cs="Times New Roman"/>
+          <w:kern w:val="0"/>
+          <w:sz w:val="24"/>
+          <w:szCs w:val="24"/>
+          <w:lang w:val="en-ID" w:eastAsia="en-ID"/>
+          <w14:ligatures w14:val="none"/>
+        </w:rPr>
+        <w:t xml:space="preserve"> lain dalam sebuah sistem untuk berkomunikasi. Secara operasional, jenis topologi yang diterapkan secara langsung berpengaruh terhadap kinerja dan performa pertukaran data secara keseluruhan. Menurut </w:t>
       </w:r>
       <w:r>
         <w:rPr>
@@ -4331,19 +4928,7 @@
           <w:lang w:val="en-ID" w:eastAsia="en-ID"/>
           <w14:ligatures w14:val="none"/>
         </w:rPr>
-        <w:t xml:space="preserve">, pemilihan jenis topologi </w:t>
-      </w:r>
-      <w:r>
-        <w:rPr>
-          <w:rFonts w:ascii="Times New Roman" w:eastAsia="Times New Roman" w:hAnsi="Times New Roman" w:cs="Times New Roman"/>
-          <w:kern w:val="0"/>
-          <w:sz w:val="24"/>
-          <w:szCs w:val="24"/>
-          <w:lang w:val="en-ID" w:eastAsia="en-ID"/>
-          <w14:ligatures w14:val="none"/>
-        </w:rPr>
-        <w:lastRenderedPageBreak/>
-        <w:t>jaringan yang tepat sangat esensial untuk mengoptimalkan distribusi rute arus data, meminimalkan latensi (</w:t>
+        <w:t>, pemilihan jenis topologi jaringan yang tepat sangat esensial untuk mengoptimalkan distribusi rute arus data, meminimalkan latensi (</w:t>
       </w:r>
       <w:r>
         <w:rPr>
@@ -4367,7 +4952,31 @@
           <w:lang w:val="en-ID" w:eastAsia="en-ID"/>
           <w14:ligatures w14:val="none"/>
         </w:rPr>
-        <w:t>), serta memudahkan administrator dalam melakukan pemeliharaan dan identifikasi masalah (</w:t>
+        <w:t xml:space="preserve">), serta memudahkan administrator dalam melakukan </w:t>
+      </w:r>
+      <w:proofErr w:type="gramStart"/>
+      <w:r>
+        <w:rPr>
+          <w:rFonts w:ascii="Times New Roman" w:eastAsia="Times New Roman" w:hAnsi="Times New Roman" w:cs="Times New Roman"/>
+          <w:kern w:val="0"/>
+          <w:sz w:val="24"/>
+          <w:szCs w:val="24"/>
+          <w:lang w:val="en-ID" w:eastAsia="en-ID"/>
+          <w14:ligatures w14:val="none"/>
+        </w:rPr>
+        <w:t>pemeliharaan</w:t>
+      </w:r>
+      <w:proofErr w:type="gramEnd"/>
+      <w:r>
+        <w:rPr>
+          <w:rFonts w:ascii="Times New Roman" w:eastAsia="Times New Roman" w:hAnsi="Times New Roman" w:cs="Times New Roman"/>
+          <w:kern w:val="0"/>
+          <w:sz w:val="24"/>
+          <w:szCs w:val="24"/>
+          <w:lang w:val="en-ID" w:eastAsia="en-ID"/>
+          <w14:ligatures w14:val="none"/>
+        </w:rPr>
+        <w:t xml:space="preserve"> dan identifikasi masalah (</w:t>
       </w:r>
       <w:r>
         <w:rPr>
@@ -4697,7 +5306,19 @@
           <w:lang w:val="en-ID" w:eastAsia="en-ID"/>
           <w14:ligatures w14:val="none"/>
         </w:rPr>
-        <w:t xml:space="preserve"> yang dapat membebani </w:t>
+        <w:t xml:space="preserve"> yang dapat </w:t>
+      </w:r>
+      <w:r>
+        <w:rPr>
+          <w:rFonts w:ascii="Times New Roman" w:eastAsia="Times New Roman" w:hAnsi="Times New Roman" w:cs="Times New Roman"/>
+          <w:kern w:val="0"/>
+          <w:sz w:val="24"/>
+          <w:szCs w:val="24"/>
+          <w:lang w:val="en-ID" w:eastAsia="en-ID"/>
+          <w14:ligatures w14:val="none"/>
+        </w:rPr>
+        <w:lastRenderedPageBreak/>
+        <w:t xml:space="preserve">membebani </w:t>
       </w:r>
       <w:r>
         <w:rPr>
@@ -4807,7 +5428,6 @@
         <w:rPr>
           <w:lang w:val="en-US" w:eastAsia="id-ID"/>
         </w:rPr>
-        <w:lastRenderedPageBreak/>
         <w:t>Penelitian Terdahulu (State of the Art)</w:t>
       </w:r>
     </w:p>
@@ -4822,7 +5442,7 @@
           <w:lang w:eastAsia="id-ID"/>
         </w:rPr>
       </w:pPr>
-      <w:bookmarkStart w:id="12" w:name="_Toc228261044"/>
+      <w:bookmarkStart w:id="13" w:name="_Toc228261044"/>
       <w:r>
         <w:rPr>
           <w:lang w:eastAsia="id-ID"/>
@@ -4844,7 +5464,7 @@
         <w:lastRenderedPageBreak/>
         <w:t>METODE PENELITIAN</w:t>
       </w:r>
-      <w:bookmarkEnd w:id="12"/>
+      <w:bookmarkEnd w:id="13"/>
     </w:p>
     <w:p>
       <w:pPr>
@@ -4865,14 +5485,14 @@
           <w:szCs w:val="32"/>
         </w:rPr>
       </w:pPr>
-      <w:bookmarkStart w:id="13" w:name="_Toc198038658"/>
-      <w:bookmarkStart w:id="14" w:name="_Toc198076010"/>
-      <w:bookmarkStart w:id="15" w:name="_Toc227680968"/>
-      <w:bookmarkStart w:id="16" w:name="_Toc228261045"/>
-      <w:bookmarkEnd w:id="13"/>
+      <w:bookmarkStart w:id="14" w:name="_Toc198038658"/>
+      <w:bookmarkStart w:id="15" w:name="_Toc198076010"/>
+      <w:bookmarkStart w:id="16" w:name="_Toc227680968"/>
+      <w:bookmarkStart w:id="17" w:name="_Toc228261045"/>
       <w:bookmarkEnd w:id="14"/>
       <w:bookmarkEnd w:id="15"/>
       <w:bookmarkEnd w:id="16"/>
+      <w:bookmarkEnd w:id="17"/>
     </w:p>
     <w:p>
       <w:pPr>
@@ -4897,12 +5517,12 @@
         </w:numPr>
         <w:ind w:left="360"/>
       </w:pPr>
-      <w:bookmarkStart w:id="17" w:name="_Toc228261046"/>
+      <w:bookmarkStart w:id="18" w:name="_Toc228261046"/>
       <w:r>
         <w:lastRenderedPageBreak/>
         <w:t>DAFTAR PUSTAKA</w:t>
       </w:r>
-      <w:bookmarkEnd w:id="17"/>
+      <w:bookmarkEnd w:id="18"/>
     </w:p>
     <w:sdt>
       <w:sdtPr>
@@ -5601,7 +6221,7 @@
 </file>
 
 <file path=word/endnotes.xml><?xml version="1.0" encoding="utf-8"?>
-<w:endnotes xmlns:wpc="http://schemas.microsoft.com/office/word/2010/wordprocessingCanvas" xmlns:cx="http://schemas.microsoft.com/office/drawing/2014/chartex" xmlns:cx1="http://schemas.microsoft.com/office/drawing/2015/9/8/chartex" xmlns:cx2="http://schemas.microsoft.com/office/drawing/2015/10/21/chartex" xmlns:cx3="http://schemas.microsoft.com/office/drawing/2016/5/9/chartex" xmlns:cx4="http://schemas.microsoft.com/office/drawing/2016/5/10/chartex" xmlns:cx5="http://schemas.microsoft.com/office/drawing/2016/5/11/chartex" xmlns:cx6="http://schemas.microsoft.com/office/drawing/2016/5/12/chartex" xmlns:cx7="http://schemas.microsoft.com/office/drawing/2016/5/13/chartex" xmlns:cx8="http://schemas.microsoft.com/office/drawing/2016/5/14/chartex" xmlns:mc="http://schemas.openxmlformats.org/markup-compatibility/2006" xmlns:aink="http://schemas.microsoft.com/office/drawing/2016/ink" xmlns:am3d="http://schemas.microsoft.com/office/drawing/2017/model3d" xmlns:o="urn:schemas-microsoft-com:office:office" xmlns:oel="http://schemas.microsoft.com/office/2019/extlst" xmlns:r="http://schemas.openxmlformats.org/officeDocument/2006/relationships" xmlns:m="http://schemas.openxmlformats.org/officeDocument/2006/math" xmlns:v="urn:schemas-microsoft-com:vml" xmlns:wp14="http://schemas.microsoft.com/office/word/2010/wordprocessingDrawing" xmlns:wp="http://schemas.openxmlformats.org/drawingml/2006/wordprocessingDrawing" xmlns:w10="urn:schemas-microsoft-com:office:word" xmlns:w="http://schemas.openxmlformats.org/wordprocessingml/2006/main" xmlns:w14="http://schemas.microsoft.com/office/word/2010/wordml" xmlns:w15="http://schemas.microsoft.com/office/word/2012/wordml" xmlns:w16cex="http://schemas.microsoft.com/office/word/2018/wordml/cex" xmlns:w16cid="http://schemas.microsoft.com/office/word/2016/wordml/cid" xmlns:w16="http://schemas.microsoft.com/office/word/2018/wordml" xmlns:w16sdtdh="http://schemas.microsoft.com/office/word/2020/wordml/sdtdatahash" xmlns:w16se="http://schemas.microsoft.com/office/word/2015/wordml/symex" xmlns:wpg="http://schemas.microsoft.com/office/word/2010/wordprocessingGroup" xmlns:wpi="http://schemas.microsoft.com/office/word/2010/wordprocessingInk" xmlns:wne="http://schemas.microsoft.com/office/word/2006/wordml" xmlns:wps="http://schemas.microsoft.com/office/word/2010/wordprocessingShape" mc:Ignorable="w14 w15 w16se w16cid w16 w16cex w16sdtdh wp14">
+<w:endnotes xmlns:wpc="http://schemas.microsoft.com/office/word/2010/wordprocessingCanvas" xmlns:mc="http://schemas.openxmlformats.org/markup-compatibility/2006" xmlns:o="urn:schemas-microsoft-com:office:office" xmlns:r="http://schemas.openxmlformats.org/officeDocument/2006/relationships" xmlns:m="http://schemas.openxmlformats.org/officeDocument/2006/math" xmlns:v="urn:schemas-microsoft-com:vml" xmlns:wp14="http://schemas.microsoft.com/office/word/2010/wordprocessingDrawing" xmlns:wp="http://schemas.openxmlformats.org/drawingml/2006/wordprocessingDrawing" xmlns:w10="urn:schemas-microsoft-com:office:word" xmlns:w="http://schemas.openxmlformats.org/wordprocessingml/2006/main" xmlns:w14="http://schemas.microsoft.com/office/word/2010/wordml" xmlns:w15="http://schemas.microsoft.com/office/word/2012/wordml" xmlns:wpg="http://schemas.microsoft.com/office/word/2010/wordprocessingGroup" xmlns:wpi="http://schemas.microsoft.com/office/word/2010/wordprocessingInk" xmlns:wne="http://schemas.microsoft.com/office/word/2006/wordml" xmlns:wps="http://schemas.microsoft.com/office/word/2010/wordprocessingShape" mc:Ignorable="w14 w15 wp14">
   <w:endnote w:type="separator" w:id="-1">
     <w:p>
       <w:pPr>
@@ -5626,7 +6246,7 @@
 </file>
 
 <file path=word/footer1.xml><?xml version="1.0" encoding="utf-8"?>
-<w:ftr xmlns:wpc="http://schemas.microsoft.com/office/word/2010/wordprocessingCanvas" xmlns:cx="http://schemas.microsoft.com/office/drawing/2014/chartex" xmlns:cx1="http://schemas.microsoft.com/office/drawing/2015/9/8/chartex" xmlns:cx2="http://schemas.microsoft.com/office/drawing/2015/10/21/chartex" xmlns:cx3="http://schemas.microsoft.com/office/drawing/2016/5/9/chartex" xmlns:cx4="http://schemas.microsoft.com/office/drawing/2016/5/10/chartex" xmlns:cx5="http://schemas.microsoft.com/office/drawing/2016/5/11/chartex" xmlns:cx6="http://schemas.microsoft.com/office/drawing/2016/5/12/chartex" xmlns:cx7="http://schemas.microsoft.com/office/drawing/2016/5/13/chartex" xmlns:cx8="http://schemas.microsoft.com/office/drawing/2016/5/14/chartex" xmlns:mc="http://schemas.openxmlformats.org/markup-compatibility/2006" xmlns:aink="http://schemas.microsoft.com/office/drawing/2016/ink" xmlns:am3d="http://schemas.microsoft.com/office/drawing/2017/model3d" xmlns:o="urn:schemas-microsoft-com:office:office" xmlns:oel="http://schemas.microsoft.com/office/2019/extlst" xmlns:r="http://schemas.openxmlformats.org/officeDocument/2006/relationships" xmlns:m="http://schemas.openxmlformats.org/officeDocument/2006/math" xmlns:v="urn:schemas-microsoft-com:vml" xmlns:wp14="http://schemas.microsoft.com/office/word/2010/wordprocessingDrawing" xmlns:wp="http://schemas.openxmlformats.org/drawingml/2006/wordprocessingDrawing" xmlns:w10="urn:schemas-microsoft-com:office:word" xmlns:w="http://schemas.openxmlformats.org/wordprocessingml/2006/main" xmlns:w14="http://schemas.microsoft.com/office/word/2010/wordml" xmlns:w15="http://schemas.microsoft.com/office/word/2012/wordml" xmlns:w16cex="http://schemas.microsoft.com/office/word/2018/wordml/cex" xmlns:w16cid="http://schemas.microsoft.com/office/word/2016/wordml/cid" xmlns:w16="http://schemas.microsoft.com/office/word/2018/wordml" xmlns:w16sdtdh="http://schemas.microsoft.com/office/word/2020/wordml/sdtdatahash" xmlns:w16se="http://schemas.microsoft.com/office/word/2015/wordml/symex" xmlns:wpg="http://schemas.microsoft.com/office/word/2010/wordprocessingGroup" xmlns:wpi="http://schemas.microsoft.com/office/word/2010/wordprocessingInk" xmlns:wne="http://schemas.microsoft.com/office/word/2006/wordml" xmlns:wps="http://schemas.microsoft.com/office/word/2010/wordprocessingShape" mc:Ignorable="w14 w15 w16se w16cid w16 w16cex w16sdtdh wp14">
+<w:ftr xmlns:wpc="http://schemas.microsoft.com/office/word/2010/wordprocessingCanvas" xmlns:mc="http://schemas.openxmlformats.org/markup-compatibility/2006" xmlns:o="urn:schemas-microsoft-com:office:office" xmlns:r="http://schemas.openxmlformats.org/officeDocument/2006/relationships" xmlns:m="http://schemas.openxmlformats.org/officeDocument/2006/math" xmlns:v="urn:schemas-microsoft-com:vml" xmlns:wp14="http://schemas.microsoft.com/office/word/2010/wordprocessingDrawing" xmlns:wp="http://schemas.openxmlformats.org/drawingml/2006/wordprocessingDrawing" xmlns:w10="urn:schemas-microsoft-com:office:word" xmlns:w="http://schemas.openxmlformats.org/wordprocessingml/2006/main" xmlns:w14="http://schemas.microsoft.com/office/word/2010/wordml" xmlns:w15="http://schemas.microsoft.com/office/word/2012/wordml" xmlns:wpg="http://schemas.microsoft.com/office/word/2010/wordprocessingGroup" xmlns:wpi="http://schemas.microsoft.com/office/word/2010/wordprocessingInk" xmlns:wne="http://schemas.microsoft.com/office/word/2006/wordml" xmlns:wps="http://schemas.microsoft.com/office/word/2010/wordprocessingShape" mc:Ignorable="w14 w15 wp14">
   <w:p>
     <w:pPr>
       <w:pStyle w:val="Footer"/>
@@ -5642,7 +6262,7 @@
 </file>
 
 <file path=word/footer2.xml><?xml version="1.0" encoding="utf-8"?>
-<w:ftr xmlns:wpc="http://schemas.microsoft.com/office/word/2010/wordprocessingCanvas" xmlns:cx="http://schemas.microsoft.com/office/drawing/2014/chartex" xmlns:cx1="http://schemas.microsoft.com/office/drawing/2015/9/8/chartex" xmlns:cx2="http://schemas.microsoft.com/office/drawing/2015/10/21/chartex" xmlns:cx3="http://schemas.microsoft.com/office/drawing/2016/5/9/chartex" xmlns:cx4="http://schemas.microsoft.com/office/drawing/2016/5/10/chartex" xmlns:cx5="http://schemas.microsoft.com/office/drawing/2016/5/11/chartex" xmlns:cx6="http://schemas.microsoft.com/office/drawing/2016/5/12/chartex" xmlns:cx7="http://schemas.microsoft.com/office/drawing/2016/5/13/chartex" xmlns:cx8="http://schemas.microsoft.com/office/drawing/2016/5/14/chartex" xmlns:mc="http://schemas.openxmlformats.org/markup-compatibility/2006" xmlns:aink="http://schemas.microsoft.com/office/drawing/2016/ink" xmlns:am3d="http://schemas.microsoft.com/office/drawing/2017/model3d" xmlns:o="urn:schemas-microsoft-com:office:office" xmlns:oel="http://schemas.microsoft.com/office/2019/extlst" xmlns:r="http://schemas.openxmlformats.org/officeDocument/2006/relationships" xmlns:m="http://schemas.openxmlformats.org/officeDocument/2006/math" xmlns:v="urn:schemas-microsoft-com:vml" xmlns:wp14="http://schemas.microsoft.com/office/word/2010/wordprocessingDrawing" xmlns:wp="http://schemas.openxmlformats.org/drawingml/2006/wordprocessingDrawing" xmlns:w10="urn:schemas-microsoft-com:office:word" xmlns:w="http://schemas.openxmlformats.org/wordprocessingml/2006/main" xmlns:w14="http://schemas.microsoft.com/office/word/2010/wordml" xmlns:w15="http://schemas.microsoft.com/office/word/2012/wordml" xmlns:w16cex="http://schemas.microsoft.com/office/word/2018/wordml/cex" xmlns:w16cid="http://schemas.microsoft.com/office/word/2016/wordml/cid" xmlns:w16="http://schemas.microsoft.com/office/word/2018/wordml" xmlns:w16sdtdh="http://schemas.microsoft.com/office/word/2020/wordml/sdtdatahash" xmlns:w16se="http://schemas.microsoft.com/office/word/2015/wordml/symex" xmlns:wpg="http://schemas.microsoft.com/office/word/2010/wordprocessingGroup" xmlns:wpi="http://schemas.microsoft.com/office/word/2010/wordprocessingInk" xmlns:wne="http://schemas.microsoft.com/office/word/2006/wordml" xmlns:wps="http://schemas.microsoft.com/office/word/2010/wordprocessingShape" mc:Ignorable="w14 w15 w16se w16cid w16 w16cex w16sdtdh wp14">
+<w:ftr xmlns:wpc="http://schemas.microsoft.com/office/word/2010/wordprocessingCanvas" xmlns:mc="http://schemas.openxmlformats.org/markup-compatibility/2006" xmlns:o="urn:schemas-microsoft-com:office:office" xmlns:r="http://schemas.openxmlformats.org/officeDocument/2006/relationships" xmlns:m="http://schemas.openxmlformats.org/officeDocument/2006/math" xmlns:v="urn:schemas-microsoft-com:vml" xmlns:wp14="http://schemas.microsoft.com/office/word/2010/wordprocessingDrawing" xmlns:wp="http://schemas.openxmlformats.org/drawingml/2006/wordprocessingDrawing" xmlns:w10="urn:schemas-microsoft-com:office:word" xmlns:w="http://schemas.openxmlformats.org/wordprocessingml/2006/main" xmlns:w14="http://schemas.microsoft.com/office/word/2010/wordml" xmlns:w15="http://schemas.microsoft.com/office/word/2012/wordml" xmlns:wpg="http://schemas.microsoft.com/office/word/2010/wordprocessingGroup" xmlns:wpi="http://schemas.microsoft.com/office/word/2010/wordprocessingInk" xmlns:wne="http://schemas.microsoft.com/office/word/2006/wordml" xmlns:wps="http://schemas.microsoft.com/office/word/2010/wordprocessingShape" mc:Ignorable="w14 w15 wp14">
   <w:sdt>
     <w:sdtPr>
       <w:id w:val="1735577906"/>
@@ -5717,7 +6337,7 @@
 </file>
 
 <file path=word/footer3.xml><?xml version="1.0" encoding="utf-8"?>
-<w:ftr xmlns:wpc="http://schemas.microsoft.com/office/word/2010/wordprocessingCanvas" xmlns:cx="http://schemas.microsoft.com/office/drawing/2014/chartex" xmlns:cx1="http://schemas.microsoft.com/office/drawing/2015/9/8/chartex" xmlns:cx2="http://schemas.microsoft.com/office/drawing/2015/10/21/chartex" xmlns:cx3="http://schemas.microsoft.com/office/drawing/2016/5/9/chartex" xmlns:cx4="http://schemas.microsoft.com/office/drawing/2016/5/10/chartex" xmlns:cx5="http://schemas.microsoft.com/office/drawing/2016/5/11/chartex" xmlns:cx6="http://schemas.microsoft.com/office/drawing/2016/5/12/chartex" xmlns:cx7="http://schemas.microsoft.com/office/drawing/2016/5/13/chartex" xmlns:cx8="http://schemas.microsoft.com/office/drawing/2016/5/14/chartex" xmlns:mc="http://schemas.openxmlformats.org/markup-compatibility/2006" xmlns:aink="http://schemas.microsoft.com/office/drawing/2016/ink" xmlns:am3d="http://schemas.microsoft.com/office/drawing/2017/model3d" xmlns:o="urn:schemas-microsoft-com:office:office" xmlns:oel="http://schemas.microsoft.com/office/2019/extlst" xmlns:r="http://schemas.openxmlformats.org/officeDocument/2006/relationships" xmlns:m="http://schemas.openxmlformats.org/officeDocument/2006/math" xmlns:v="urn:schemas-microsoft-com:vml" xmlns:wp14="http://schemas.microsoft.com/office/word/2010/wordprocessingDrawing" xmlns:wp="http://schemas.openxmlformats.org/drawingml/2006/wordprocessingDrawing" xmlns:w10="urn:schemas-microsoft-com:office:word" xmlns:w="http://schemas.openxmlformats.org/wordprocessingml/2006/main" xmlns:w14="http://schemas.microsoft.com/office/word/2010/wordml" xmlns:w15="http://schemas.microsoft.com/office/word/2012/wordml" xmlns:w16cex="http://schemas.microsoft.com/office/word/2018/wordml/cex" xmlns:w16cid="http://schemas.microsoft.com/office/word/2016/wordml/cid" xmlns:w16="http://schemas.microsoft.com/office/word/2018/wordml" xmlns:w16sdtdh="http://schemas.microsoft.com/office/word/2020/wordml/sdtdatahash" xmlns:w16se="http://schemas.microsoft.com/office/word/2015/wordml/symex" xmlns:wpg="http://schemas.microsoft.com/office/word/2010/wordprocessingGroup" xmlns:wpi="http://schemas.microsoft.com/office/word/2010/wordprocessingInk" xmlns:wne="http://schemas.microsoft.com/office/word/2006/wordml" xmlns:wps="http://schemas.microsoft.com/office/word/2010/wordprocessingShape" mc:Ignorable="w14 w15 w16se w16cid w16 w16cex w16sdtdh wp14">
+<w:ftr xmlns:wpc="http://schemas.microsoft.com/office/word/2010/wordprocessingCanvas" xmlns:mc="http://schemas.openxmlformats.org/markup-compatibility/2006" xmlns:o="urn:schemas-microsoft-com:office:office" xmlns:r="http://schemas.openxmlformats.org/officeDocument/2006/relationships" xmlns:m="http://schemas.openxmlformats.org/officeDocument/2006/math" xmlns:v="urn:schemas-microsoft-com:vml" xmlns:wp14="http://schemas.microsoft.com/office/word/2010/wordprocessingDrawing" xmlns:wp="http://schemas.openxmlformats.org/drawingml/2006/wordprocessingDrawing" xmlns:w10="urn:schemas-microsoft-com:office:word" xmlns:w="http://schemas.openxmlformats.org/wordprocessingml/2006/main" xmlns:w14="http://schemas.microsoft.com/office/word/2010/wordml" xmlns:w15="http://schemas.microsoft.com/office/word/2012/wordml" xmlns:wpg="http://schemas.microsoft.com/office/word/2010/wordprocessingGroup" xmlns:wpi="http://schemas.microsoft.com/office/word/2010/wordprocessingInk" xmlns:wne="http://schemas.microsoft.com/office/word/2006/wordml" xmlns:wps="http://schemas.microsoft.com/office/word/2010/wordprocessingShape" mc:Ignorable="w14 w15 wp14">
   <w:sdt>
     <w:sdtPr>
       <w:id w:val="-654841444"/>
@@ -5770,7 +6390,7 @@
 </file>
 
 <file path=word/footer4.xml><?xml version="1.0" encoding="utf-8"?>
-<w:ftr xmlns:wpc="http://schemas.microsoft.com/office/word/2010/wordprocessingCanvas" xmlns:cx="http://schemas.microsoft.com/office/drawing/2014/chartex" xmlns:cx1="http://schemas.microsoft.com/office/drawing/2015/9/8/chartex" xmlns:cx2="http://schemas.microsoft.com/office/drawing/2015/10/21/chartex" xmlns:cx3="http://schemas.microsoft.com/office/drawing/2016/5/9/chartex" xmlns:cx4="http://schemas.microsoft.com/office/drawing/2016/5/10/chartex" xmlns:cx5="http://schemas.microsoft.com/office/drawing/2016/5/11/chartex" xmlns:cx6="http://schemas.microsoft.com/office/drawing/2016/5/12/chartex" xmlns:cx7="http://schemas.microsoft.com/office/drawing/2016/5/13/chartex" xmlns:cx8="http://schemas.microsoft.com/office/drawing/2016/5/14/chartex" xmlns:mc="http://schemas.openxmlformats.org/markup-compatibility/2006" xmlns:aink="http://schemas.microsoft.com/office/drawing/2016/ink" xmlns:am3d="http://schemas.microsoft.com/office/drawing/2017/model3d" xmlns:o="urn:schemas-microsoft-com:office:office" xmlns:oel="http://schemas.microsoft.com/office/2019/extlst" xmlns:r="http://schemas.openxmlformats.org/officeDocument/2006/relationships" xmlns:m="http://schemas.openxmlformats.org/officeDocument/2006/math" xmlns:v="urn:schemas-microsoft-com:vml" xmlns:wp14="http://schemas.microsoft.com/office/word/2010/wordprocessingDrawing" xmlns:wp="http://schemas.openxmlformats.org/drawingml/2006/wordprocessingDrawing" xmlns:w10="urn:schemas-microsoft-com:office:word" xmlns:w="http://schemas.openxmlformats.org/wordprocessingml/2006/main" xmlns:w14="http://schemas.microsoft.com/office/word/2010/wordml" xmlns:w15="http://schemas.microsoft.com/office/word/2012/wordml" xmlns:w16cex="http://schemas.microsoft.com/office/word/2018/wordml/cex" xmlns:w16cid="http://schemas.microsoft.com/office/word/2016/wordml/cid" xmlns:w16="http://schemas.microsoft.com/office/word/2018/wordml" xmlns:w16sdtdh="http://schemas.microsoft.com/office/word/2020/wordml/sdtdatahash" xmlns:w16se="http://schemas.microsoft.com/office/word/2015/wordml/symex" xmlns:wpg="http://schemas.microsoft.com/office/word/2010/wordprocessingGroup" xmlns:wpi="http://schemas.microsoft.com/office/word/2010/wordprocessingInk" xmlns:wne="http://schemas.microsoft.com/office/word/2006/wordml" xmlns:wps="http://schemas.microsoft.com/office/word/2010/wordprocessingShape" mc:Ignorable="w14 w15 w16se w16cid w16 w16cex w16sdtdh wp14">
+<w:ftr xmlns:wpc="http://schemas.microsoft.com/office/word/2010/wordprocessingCanvas" xmlns:mc="http://schemas.openxmlformats.org/markup-compatibility/2006" xmlns:o="urn:schemas-microsoft-com:office:office" xmlns:r="http://schemas.openxmlformats.org/officeDocument/2006/relationships" xmlns:m="http://schemas.openxmlformats.org/officeDocument/2006/math" xmlns:v="urn:schemas-microsoft-com:vml" xmlns:wp14="http://schemas.microsoft.com/office/word/2010/wordprocessingDrawing" xmlns:wp="http://schemas.openxmlformats.org/drawingml/2006/wordprocessingDrawing" xmlns:w10="urn:schemas-microsoft-com:office:word" xmlns:w="http://schemas.openxmlformats.org/wordprocessingml/2006/main" xmlns:w14="http://schemas.microsoft.com/office/word/2010/wordml" xmlns:w15="http://schemas.microsoft.com/office/word/2012/wordml" xmlns:wpg="http://schemas.microsoft.com/office/word/2010/wordprocessingGroup" xmlns:wpi="http://schemas.microsoft.com/office/word/2010/wordprocessingInk" xmlns:wne="http://schemas.microsoft.com/office/word/2006/wordml" xmlns:wps="http://schemas.microsoft.com/office/word/2010/wordprocessingShape" mc:Ignorable="w14 w15 wp14">
   <w:p>
     <w:pPr>
       <w:pStyle w:val="Footer"/>
@@ -5791,7 +6411,7 @@
 </file>
 
 <file path=word/footer5.xml><?xml version="1.0" encoding="utf-8"?>
-<w:ftr xmlns:wpc="http://schemas.microsoft.com/office/word/2010/wordprocessingCanvas" xmlns:cx="http://schemas.microsoft.com/office/drawing/2014/chartex" xmlns:cx1="http://schemas.microsoft.com/office/drawing/2015/9/8/chartex" xmlns:cx2="http://schemas.microsoft.com/office/drawing/2015/10/21/chartex" xmlns:cx3="http://schemas.microsoft.com/office/drawing/2016/5/9/chartex" xmlns:cx4="http://schemas.microsoft.com/office/drawing/2016/5/10/chartex" xmlns:cx5="http://schemas.microsoft.com/office/drawing/2016/5/11/chartex" xmlns:cx6="http://schemas.microsoft.com/office/drawing/2016/5/12/chartex" xmlns:cx7="http://schemas.microsoft.com/office/drawing/2016/5/13/chartex" xmlns:cx8="http://schemas.microsoft.com/office/drawing/2016/5/14/chartex" xmlns:mc="http://schemas.openxmlformats.org/markup-compatibility/2006" xmlns:aink="http://schemas.microsoft.com/office/drawing/2016/ink" xmlns:am3d="http://schemas.microsoft.com/office/drawing/2017/model3d" xmlns:o="urn:schemas-microsoft-com:office:office" xmlns:oel="http://schemas.microsoft.com/office/2019/extlst" xmlns:r="http://schemas.openxmlformats.org/officeDocument/2006/relationships" xmlns:m="http://schemas.openxmlformats.org/officeDocument/2006/math" xmlns:v="urn:schemas-microsoft-com:vml" xmlns:wp14="http://schemas.microsoft.com/office/word/2010/wordprocessingDrawing" xmlns:wp="http://schemas.openxmlformats.org/drawingml/2006/wordprocessingDrawing" xmlns:w10="urn:schemas-microsoft-com:office:word" xmlns:w="http://schemas.openxmlformats.org/wordprocessingml/2006/main" xmlns:w14="http://schemas.microsoft.com/office/word/2010/wordml" xmlns:w15="http://schemas.microsoft.com/office/word/2012/wordml" xmlns:w16cex="http://schemas.microsoft.com/office/word/2018/wordml/cex" xmlns:w16cid="http://schemas.microsoft.com/office/word/2016/wordml/cid" xmlns:w16="http://schemas.microsoft.com/office/word/2018/wordml" xmlns:w16sdtdh="http://schemas.microsoft.com/office/word/2020/wordml/sdtdatahash" xmlns:w16se="http://schemas.microsoft.com/office/word/2015/wordml/symex" xmlns:wpg="http://schemas.microsoft.com/office/word/2010/wordprocessingGroup" xmlns:wpi="http://schemas.microsoft.com/office/word/2010/wordprocessingInk" xmlns:wne="http://schemas.microsoft.com/office/word/2006/wordml" xmlns:wps="http://schemas.microsoft.com/office/word/2010/wordprocessingShape" mc:Ignorable="w14 w15 w16se w16cid w16 w16cex w16sdtdh wp14">
+<w:ftr xmlns:wpc="http://schemas.microsoft.com/office/word/2010/wordprocessingCanvas" xmlns:mc="http://schemas.openxmlformats.org/markup-compatibility/2006" xmlns:o="urn:schemas-microsoft-com:office:office" xmlns:r="http://schemas.openxmlformats.org/officeDocument/2006/relationships" xmlns:m="http://schemas.openxmlformats.org/officeDocument/2006/math" xmlns:v="urn:schemas-microsoft-com:vml" xmlns:wp14="http://schemas.microsoft.com/office/word/2010/wordprocessingDrawing" xmlns:wp="http://schemas.openxmlformats.org/drawingml/2006/wordprocessingDrawing" xmlns:w10="urn:schemas-microsoft-com:office:word" xmlns:w="http://schemas.openxmlformats.org/wordprocessingml/2006/main" xmlns:w14="http://schemas.microsoft.com/office/word/2010/wordml" xmlns:w15="http://schemas.microsoft.com/office/word/2012/wordml" xmlns:wpg="http://schemas.microsoft.com/office/word/2010/wordprocessingGroup" xmlns:wpi="http://schemas.microsoft.com/office/word/2010/wordprocessingInk" xmlns:wne="http://schemas.microsoft.com/office/word/2006/wordml" xmlns:wps="http://schemas.microsoft.com/office/word/2010/wordprocessingShape" mc:Ignorable="w14 w15 wp14">
   <w:sdt>
     <w:sdtPr>
       <w:id w:val="1105767670"/>
@@ -5843,7 +6463,7 @@
 </file>
 
 <file path=word/footer6.xml><?xml version="1.0" encoding="utf-8"?>
-<w:ftr xmlns:wpc="http://schemas.microsoft.com/office/word/2010/wordprocessingCanvas" xmlns:cx="http://schemas.microsoft.com/office/drawing/2014/chartex" xmlns:cx1="http://schemas.microsoft.com/office/drawing/2015/9/8/chartex" xmlns:cx2="http://schemas.microsoft.com/office/drawing/2015/10/21/chartex" xmlns:cx3="http://schemas.microsoft.com/office/drawing/2016/5/9/chartex" xmlns:cx4="http://schemas.microsoft.com/office/drawing/2016/5/10/chartex" xmlns:cx5="http://schemas.microsoft.com/office/drawing/2016/5/11/chartex" xmlns:cx6="http://schemas.microsoft.com/office/drawing/2016/5/12/chartex" xmlns:cx7="http://schemas.microsoft.com/office/drawing/2016/5/13/chartex" xmlns:cx8="http://schemas.microsoft.com/office/drawing/2016/5/14/chartex" xmlns:mc="http://schemas.openxmlformats.org/markup-compatibility/2006" xmlns:aink="http://schemas.microsoft.com/office/drawing/2016/ink" xmlns:am3d="http://schemas.microsoft.com/office/drawing/2017/model3d" xmlns:o="urn:schemas-microsoft-com:office:office" xmlns:oel="http://schemas.microsoft.com/office/2019/extlst" xmlns:r="http://schemas.openxmlformats.org/officeDocument/2006/relationships" xmlns:m="http://schemas.openxmlformats.org/officeDocument/2006/math" xmlns:v="urn:schemas-microsoft-com:vml" xmlns:wp14="http://schemas.microsoft.com/office/word/2010/wordprocessingDrawing" xmlns:wp="http://schemas.openxmlformats.org/drawingml/2006/wordprocessingDrawing" xmlns:w10="urn:schemas-microsoft-com:office:word" xmlns:w="http://schemas.openxmlformats.org/wordprocessingml/2006/main" xmlns:w14="http://schemas.microsoft.com/office/word/2010/wordml" xmlns:w15="http://schemas.microsoft.com/office/word/2012/wordml" xmlns:w16cex="http://schemas.microsoft.com/office/word/2018/wordml/cex" xmlns:w16cid="http://schemas.microsoft.com/office/word/2016/wordml/cid" xmlns:w16="http://schemas.microsoft.com/office/word/2018/wordml" xmlns:w16sdtdh="http://schemas.microsoft.com/office/word/2020/wordml/sdtdatahash" xmlns:w16se="http://schemas.microsoft.com/office/word/2015/wordml/symex" xmlns:wpg="http://schemas.microsoft.com/office/word/2010/wordprocessingGroup" xmlns:wpi="http://schemas.microsoft.com/office/word/2010/wordprocessingInk" xmlns:wne="http://schemas.microsoft.com/office/word/2006/wordml" xmlns:wps="http://schemas.microsoft.com/office/word/2010/wordprocessingShape" mc:Ignorable="w14 w15 w16se w16cid w16 w16cex w16sdtdh wp14">
+<w:ftr xmlns:wpc="http://schemas.microsoft.com/office/word/2010/wordprocessingCanvas" xmlns:mc="http://schemas.openxmlformats.org/markup-compatibility/2006" xmlns:o="urn:schemas-microsoft-com:office:office" xmlns:r="http://schemas.openxmlformats.org/officeDocument/2006/relationships" xmlns:m="http://schemas.openxmlformats.org/officeDocument/2006/math" xmlns:v="urn:schemas-microsoft-com:vml" xmlns:wp14="http://schemas.microsoft.com/office/word/2010/wordprocessingDrawing" xmlns:wp="http://schemas.openxmlformats.org/drawingml/2006/wordprocessingDrawing" xmlns:w10="urn:schemas-microsoft-com:office:word" xmlns:w="http://schemas.openxmlformats.org/wordprocessingml/2006/main" xmlns:w14="http://schemas.microsoft.com/office/word/2010/wordml" xmlns:w15="http://schemas.microsoft.com/office/word/2012/wordml" xmlns:wpg="http://schemas.microsoft.com/office/word/2010/wordprocessingGroup" xmlns:wpi="http://schemas.microsoft.com/office/word/2010/wordprocessingInk" xmlns:wne="http://schemas.microsoft.com/office/word/2006/wordml" xmlns:wps="http://schemas.microsoft.com/office/word/2010/wordprocessingShape" mc:Ignorable="w14 w15 wp14">
   <w:p>
     <w:pPr>
       <w:pStyle w:val="Footer"/>
@@ -5864,7 +6484,7 @@
 </file>
 
 <file path=word/footer7.xml><?xml version="1.0" encoding="utf-8"?>
-<w:ftr xmlns:wpc="http://schemas.microsoft.com/office/word/2010/wordprocessingCanvas" xmlns:cx="http://schemas.microsoft.com/office/drawing/2014/chartex" xmlns:cx1="http://schemas.microsoft.com/office/drawing/2015/9/8/chartex" xmlns:cx2="http://schemas.microsoft.com/office/drawing/2015/10/21/chartex" xmlns:cx3="http://schemas.microsoft.com/office/drawing/2016/5/9/chartex" xmlns:cx4="http://schemas.microsoft.com/office/drawing/2016/5/10/chartex" xmlns:cx5="http://schemas.microsoft.com/office/drawing/2016/5/11/chartex" xmlns:cx6="http://schemas.microsoft.com/office/drawing/2016/5/12/chartex" xmlns:cx7="http://schemas.microsoft.com/office/drawing/2016/5/13/chartex" xmlns:cx8="http://schemas.microsoft.com/office/drawing/2016/5/14/chartex" xmlns:mc="http://schemas.openxmlformats.org/markup-compatibility/2006" xmlns:aink="http://schemas.microsoft.com/office/drawing/2016/ink" xmlns:am3d="http://schemas.microsoft.com/office/drawing/2017/model3d" xmlns:o="urn:schemas-microsoft-com:office:office" xmlns:oel="http://schemas.microsoft.com/office/2019/extlst" xmlns:r="http://schemas.openxmlformats.org/officeDocument/2006/relationships" xmlns:m="http://schemas.openxmlformats.org/officeDocument/2006/math" xmlns:v="urn:schemas-microsoft-com:vml" xmlns:wp14="http://schemas.microsoft.com/office/word/2010/wordprocessingDrawing" xmlns:wp="http://schemas.openxmlformats.org/drawingml/2006/wordprocessingDrawing" xmlns:w10="urn:schemas-microsoft-com:office:word" xmlns:w="http://schemas.openxmlformats.org/wordprocessingml/2006/main" xmlns:w14="http://schemas.microsoft.com/office/word/2010/wordml" xmlns:w15="http://schemas.microsoft.com/office/word/2012/wordml" xmlns:w16cex="http://schemas.microsoft.com/office/word/2018/wordml/cex" xmlns:w16cid="http://schemas.microsoft.com/office/word/2016/wordml/cid" xmlns:w16="http://schemas.microsoft.com/office/word/2018/wordml" xmlns:w16sdtdh="http://schemas.microsoft.com/office/word/2020/wordml/sdtdatahash" xmlns:w16se="http://schemas.microsoft.com/office/word/2015/wordml/symex" xmlns:wpg="http://schemas.microsoft.com/office/word/2010/wordprocessingGroup" xmlns:wpi="http://schemas.microsoft.com/office/word/2010/wordprocessingInk" xmlns:wne="http://schemas.microsoft.com/office/word/2006/wordml" xmlns:wps="http://schemas.microsoft.com/office/word/2010/wordprocessingShape" mc:Ignorable="w14 w15 w16se w16cid w16 w16cex w16sdtdh wp14">
+<w:ftr xmlns:wpc="http://schemas.microsoft.com/office/word/2010/wordprocessingCanvas" xmlns:mc="http://schemas.openxmlformats.org/markup-compatibility/2006" xmlns:o="urn:schemas-microsoft-com:office:office" xmlns:r="http://schemas.openxmlformats.org/officeDocument/2006/relationships" xmlns:m="http://schemas.openxmlformats.org/officeDocument/2006/math" xmlns:v="urn:schemas-microsoft-com:vml" xmlns:wp14="http://schemas.microsoft.com/office/word/2010/wordprocessingDrawing" xmlns:wp="http://schemas.openxmlformats.org/drawingml/2006/wordprocessingDrawing" xmlns:w10="urn:schemas-microsoft-com:office:word" xmlns:w="http://schemas.openxmlformats.org/wordprocessingml/2006/main" xmlns:w14="http://schemas.microsoft.com/office/word/2010/wordml" xmlns:w15="http://schemas.microsoft.com/office/word/2012/wordml" xmlns:wpg="http://schemas.microsoft.com/office/word/2010/wordprocessingGroup" xmlns:wpi="http://schemas.microsoft.com/office/word/2010/wordprocessingInk" xmlns:wne="http://schemas.microsoft.com/office/word/2006/wordml" xmlns:wps="http://schemas.microsoft.com/office/word/2010/wordprocessingShape" mc:Ignorable="w14 w15 wp14">
   <w:sdt>
     <w:sdtPr>
       <w:id w:val="79723734"/>
@@ -5916,7 +6536,7 @@
 </file>
 
 <file path=word/footnotes.xml><?xml version="1.0" encoding="utf-8"?>
-<w:footnotes xmlns:wpc="http://schemas.microsoft.com/office/word/2010/wordprocessingCanvas" xmlns:cx="http://schemas.microsoft.com/office/drawing/2014/chartex" xmlns:cx1="http://schemas.microsoft.com/office/drawing/2015/9/8/chartex" xmlns:cx2="http://schemas.microsoft.com/office/drawing/2015/10/21/chartex" xmlns:cx3="http://schemas.microsoft.com/office/drawing/2016/5/9/chartex" xmlns:cx4="http://schemas.microsoft.com/office/drawing/2016/5/10/chartex" xmlns:cx5="http://schemas.microsoft.com/office/drawing/2016/5/11/chartex" xmlns:cx6="http://schemas.microsoft.com/office/drawing/2016/5/12/chartex" xmlns:cx7="http://schemas.microsoft.com/office/drawing/2016/5/13/chartex" xmlns:cx8="http://schemas.microsoft.com/office/drawing/2016/5/14/chartex" xmlns:mc="http://schemas.openxmlformats.org/markup-compatibility/2006" xmlns:aink="http://schemas.microsoft.com/office/drawing/2016/ink" xmlns:am3d="http://schemas.microsoft.com/office/drawing/2017/model3d" xmlns:o="urn:schemas-microsoft-com:office:office" xmlns:oel="http://schemas.microsoft.com/office/2019/extlst" xmlns:r="http://schemas.openxmlformats.org/officeDocument/2006/relationships" xmlns:m="http://schemas.openxmlformats.org/officeDocument/2006/math" xmlns:v="urn:schemas-microsoft-com:vml" xmlns:wp14="http://schemas.microsoft.com/office/word/2010/wordprocessingDrawing" xmlns:wp="http://schemas.openxmlformats.org/drawingml/2006/wordprocessingDrawing" xmlns:w10="urn:schemas-microsoft-com:office:word" xmlns:w="http://schemas.openxmlformats.org/wordprocessingml/2006/main" xmlns:w14="http://schemas.microsoft.com/office/word/2010/wordml" xmlns:w15="http://schemas.microsoft.com/office/word/2012/wordml" xmlns:w16cex="http://schemas.microsoft.com/office/word/2018/wordml/cex" xmlns:w16cid="http://schemas.microsoft.com/office/word/2016/wordml/cid" xmlns:w16="http://schemas.microsoft.com/office/word/2018/wordml" xmlns:w16sdtdh="http://schemas.microsoft.com/office/word/2020/wordml/sdtdatahash" xmlns:w16se="http://schemas.microsoft.com/office/word/2015/wordml/symex" xmlns:wpg="http://schemas.microsoft.com/office/word/2010/wordprocessingGroup" xmlns:wpi="http://schemas.microsoft.com/office/word/2010/wordprocessingInk" xmlns:wne="http://schemas.microsoft.com/office/word/2006/wordml" xmlns:wps="http://schemas.microsoft.com/office/word/2010/wordprocessingShape" mc:Ignorable="w14 w15 w16se w16cid w16 w16cex w16sdtdh wp14">
+<w:footnotes xmlns:wpc="http://schemas.microsoft.com/office/word/2010/wordprocessingCanvas" xmlns:mc="http://schemas.openxmlformats.org/markup-compatibility/2006" xmlns:o="urn:schemas-microsoft-com:office:office" xmlns:r="http://schemas.openxmlformats.org/officeDocument/2006/relationships" xmlns:m="http://schemas.openxmlformats.org/officeDocument/2006/math" xmlns:v="urn:schemas-microsoft-com:vml" xmlns:wp14="http://schemas.microsoft.com/office/word/2010/wordprocessingDrawing" xmlns:wp="http://schemas.openxmlformats.org/drawingml/2006/wordprocessingDrawing" xmlns:w10="urn:schemas-microsoft-com:office:word" xmlns:w="http://schemas.openxmlformats.org/wordprocessingml/2006/main" xmlns:w14="http://schemas.microsoft.com/office/word/2010/wordml" xmlns:w15="http://schemas.microsoft.com/office/word/2012/wordml" xmlns:wpg="http://schemas.microsoft.com/office/word/2010/wordprocessingGroup" xmlns:wpi="http://schemas.microsoft.com/office/word/2010/wordprocessingInk" xmlns:wne="http://schemas.microsoft.com/office/word/2006/wordml" xmlns:wps="http://schemas.microsoft.com/office/word/2010/wordprocessingShape" mc:Ignorable="w14 w15 wp14">
   <w:footnote w:type="separator" w:id="-1">
     <w:p>
       <w:pPr>
@@ -5941,7 +6561,7 @@
 </file>
 
 <file path=word/header1.xml><?xml version="1.0" encoding="utf-8"?>
-<w:hdr xmlns:wpc="http://schemas.microsoft.com/office/word/2010/wordprocessingCanvas" xmlns:cx="http://schemas.microsoft.com/office/drawing/2014/chartex" xmlns:cx1="http://schemas.microsoft.com/office/drawing/2015/9/8/chartex" xmlns:cx2="http://schemas.microsoft.com/office/drawing/2015/10/21/chartex" xmlns:cx3="http://schemas.microsoft.com/office/drawing/2016/5/9/chartex" xmlns:cx4="http://schemas.microsoft.com/office/drawing/2016/5/10/chartex" xmlns:cx5="http://schemas.microsoft.com/office/drawing/2016/5/11/chartex" xmlns:cx6="http://schemas.microsoft.com/office/drawing/2016/5/12/chartex" xmlns:cx7="http://schemas.microsoft.com/office/drawing/2016/5/13/chartex" xmlns:cx8="http://schemas.microsoft.com/office/drawing/2016/5/14/chartex" xmlns:mc="http://schemas.openxmlformats.org/markup-compatibility/2006" xmlns:aink="http://schemas.microsoft.com/office/drawing/2016/ink" xmlns:am3d="http://schemas.microsoft.com/office/drawing/2017/model3d" xmlns:o="urn:schemas-microsoft-com:office:office" xmlns:oel="http://schemas.microsoft.com/office/2019/extlst" xmlns:r="http://schemas.openxmlformats.org/officeDocument/2006/relationships" xmlns:m="http://schemas.openxmlformats.org/officeDocument/2006/math" xmlns:v="urn:schemas-microsoft-com:vml" xmlns:wp14="http://schemas.microsoft.com/office/word/2010/wordprocessingDrawing" xmlns:wp="http://schemas.openxmlformats.org/drawingml/2006/wordprocessingDrawing" xmlns:w10="urn:schemas-microsoft-com:office:word" xmlns:w="http://schemas.openxmlformats.org/wordprocessingml/2006/main" xmlns:w14="http://schemas.microsoft.com/office/word/2010/wordml" xmlns:w15="http://schemas.microsoft.com/office/word/2012/wordml" xmlns:w16cex="http://schemas.microsoft.com/office/word/2018/wordml/cex" xmlns:w16cid="http://schemas.microsoft.com/office/word/2016/wordml/cid" xmlns:w16="http://schemas.microsoft.com/office/word/2018/wordml" xmlns:w16sdtdh="http://schemas.microsoft.com/office/word/2020/wordml/sdtdatahash" xmlns:w16se="http://schemas.microsoft.com/office/word/2015/wordml/symex" xmlns:wpg="http://schemas.microsoft.com/office/word/2010/wordprocessingGroup" xmlns:wpi="http://schemas.microsoft.com/office/word/2010/wordprocessingInk" xmlns:wne="http://schemas.microsoft.com/office/word/2006/wordml" xmlns:wps="http://schemas.microsoft.com/office/word/2010/wordprocessingShape" mc:Ignorable="w14 w15 w16se w16cid w16 w16cex w16sdtdh wp14">
+<w:hdr xmlns:wpc="http://schemas.microsoft.com/office/word/2010/wordprocessingCanvas" xmlns:mc="http://schemas.openxmlformats.org/markup-compatibility/2006" xmlns:o="urn:schemas-microsoft-com:office:office" xmlns:r="http://schemas.openxmlformats.org/officeDocument/2006/relationships" xmlns:m="http://schemas.openxmlformats.org/officeDocument/2006/math" xmlns:v="urn:schemas-microsoft-com:vml" xmlns:wp14="http://schemas.microsoft.com/office/word/2010/wordprocessingDrawing" xmlns:wp="http://schemas.openxmlformats.org/drawingml/2006/wordprocessingDrawing" xmlns:w10="urn:schemas-microsoft-com:office:word" xmlns:w="http://schemas.openxmlformats.org/wordprocessingml/2006/main" xmlns:w14="http://schemas.microsoft.com/office/word/2010/wordml" xmlns:w15="http://schemas.microsoft.com/office/word/2012/wordml" xmlns:wpg="http://schemas.microsoft.com/office/word/2010/wordprocessingGroup" xmlns:wpi="http://schemas.microsoft.com/office/word/2010/wordprocessingInk" xmlns:wne="http://schemas.microsoft.com/office/word/2006/wordml" xmlns:wps="http://schemas.microsoft.com/office/word/2010/wordprocessingShape" mc:Ignorable="w14 w15 wp14">
   <w:p>
     <w:pPr>
       <w:pStyle w:val="Header"/>
@@ -5952,7 +6572,7 @@
 </file>
 
 <file path=word/header2.xml><?xml version="1.0" encoding="utf-8"?>
-<w:hdr xmlns:wpc="http://schemas.microsoft.com/office/word/2010/wordprocessingCanvas" xmlns:cx="http://schemas.microsoft.com/office/drawing/2014/chartex" xmlns:cx1="http://schemas.microsoft.com/office/drawing/2015/9/8/chartex" xmlns:cx2="http://schemas.microsoft.com/office/drawing/2015/10/21/chartex" xmlns:cx3="http://schemas.microsoft.com/office/drawing/2016/5/9/chartex" xmlns:cx4="http://schemas.microsoft.com/office/drawing/2016/5/10/chartex" xmlns:cx5="http://schemas.microsoft.com/office/drawing/2016/5/11/chartex" xmlns:cx6="http://schemas.microsoft.com/office/drawing/2016/5/12/chartex" xmlns:cx7="http://schemas.microsoft.com/office/drawing/2016/5/13/chartex" xmlns:cx8="http://schemas.microsoft.com/office/drawing/2016/5/14/chartex" xmlns:mc="http://schemas.openxmlformats.org/markup-compatibility/2006" xmlns:aink="http://schemas.microsoft.com/office/drawing/2016/ink" xmlns:am3d="http://schemas.microsoft.com/office/drawing/2017/model3d" xmlns:o="urn:schemas-microsoft-com:office:office" xmlns:oel="http://schemas.microsoft.com/office/2019/extlst" xmlns:r="http://schemas.openxmlformats.org/officeDocument/2006/relationships" xmlns:m="http://schemas.openxmlformats.org/officeDocument/2006/math" xmlns:v="urn:schemas-microsoft-com:vml" xmlns:wp14="http://schemas.microsoft.com/office/word/2010/wordprocessingDrawing" xmlns:wp="http://schemas.openxmlformats.org/drawingml/2006/wordprocessingDrawing" xmlns:w10="urn:schemas-microsoft-com:office:word" xmlns:w="http://schemas.openxmlformats.org/wordprocessingml/2006/main" xmlns:w14="http://schemas.microsoft.com/office/word/2010/wordml" xmlns:w15="http://schemas.microsoft.com/office/word/2012/wordml" xmlns:w16cex="http://schemas.microsoft.com/office/word/2018/wordml/cex" xmlns:w16cid="http://schemas.microsoft.com/office/word/2016/wordml/cid" xmlns:w16="http://schemas.microsoft.com/office/word/2018/wordml" xmlns:w16sdtdh="http://schemas.microsoft.com/office/word/2020/wordml/sdtdatahash" xmlns:w16se="http://schemas.microsoft.com/office/word/2015/wordml/symex" xmlns:wpg="http://schemas.microsoft.com/office/word/2010/wordprocessingGroup" xmlns:wpi="http://schemas.microsoft.com/office/word/2010/wordprocessingInk" xmlns:wne="http://schemas.microsoft.com/office/word/2006/wordml" xmlns:wps="http://schemas.microsoft.com/office/word/2010/wordprocessingShape" mc:Ignorable="w14 w15 w16se w16cid w16 w16cex w16sdtdh wp14">
+<w:hdr xmlns:wpc="http://schemas.microsoft.com/office/word/2010/wordprocessingCanvas" xmlns:mc="http://schemas.openxmlformats.org/markup-compatibility/2006" xmlns:o="urn:schemas-microsoft-com:office:office" xmlns:r="http://schemas.openxmlformats.org/officeDocument/2006/relationships" xmlns:m="http://schemas.openxmlformats.org/officeDocument/2006/math" xmlns:v="urn:schemas-microsoft-com:vml" xmlns:wp14="http://schemas.microsoft.com/office/word/2010/wordprocessingDrawing" xmlns:wp="http://schemas.openxmlformats.org/drawingml/2006/wordprocessingDrawing" xmlns:w10="urn:schemas-microsoft-com:office:word" xmlns:w="http://schemas.openxmlformats.org/wordprocessingml/2006/main" xmlns:w14="http://schemas.microsoft.com/office/word/2010/wordml" xmlns:w15="http://schemas.microsoft.com/office/word/2012/wordml" xmlns:wpg="http://schemas.microsoft.com/office/word/2010/wordprocessingGroup" xmlns:wpi="http://schemas.microsoft.com/office/word/2010/wordprocessingInk" xmlns:wne="http://schemas.microsoft.com/office/word/2006/wordml" xmlns:wps="http://schemas.microsoft.com/office/word/2010/wordprocessingShape" mc:Ignorable="w14 w15 wp14">
   <w:p>
     <w:pPr>
       <w:pStyle w:val="Header"/>
@@ -5963,7 +6583,7 @@
 </file>
 
 <file path=word/header3.xml><?xml version="1.0" encoding="utf-8"?>
-<w:hdr xmlns:wpc="http://schemas.microsoft.com/office/word/2010/wordprocessingCanvas" xmlns:cx="http://schemas.microsoft.com/office/drawing/2014/chartex" xmlns:cx1="http://schemas.microsoft.com/office/drawing/2015/9/8/chartex" xmlns:cx2="http://schemas.microsoft.com/office/drawing/2015/10/21/chartex" xmlns:cx3="http://schemas.microsoft.com/office/drawing/2016/5/9/chartex" xmlns:cx4="http://schemas.microsoft.com/office/drawing/2016/5/10/chartex" xmlns:cx5="http://schemas.microsoft.com/office/drawing/2016/5/11/chartex" xmlns:cx6="http://schemas.microsoft.com/office/drawing/2016/5/12/chartex" xmlns:cx7="http://schemas.microsoft.com/office/drawing/2016/5/13/chartex" xmlns:cx8="http://schemas.microsoft.com/office/drawing/2016/5/14/chartex" xmlns:mc="http://schemas.openxmlformats.org/markup-compatibility/2006" xmlns:aink="http://schemas.microsoft.com/office/drawing/2016/ink" xmlns:am3d="http://schemas.microsoft.com/office/drawing/2017/model3d" xmlns:o="urn:schemas-microsoft-com:office:office" xmlns:oel="http://schemas.microsoft.com/office/2019/extlst" xmlns:r="http://schemas.openxmlformats.org/officeDocument/2006/relationships" xmlns:m="http://schemas.openxmlformats.org/officeDocument/2006/math" xmlns:v="urn:schemas-microsoft-com:vml" xmlns:wp14="http://schemas.microsoft.com/office/word/2010/wordprocessingDrawing" xmlns:wp="http://schemas.openxmlformats.org/drawingml/2006/wordprocessingDrawing" xmlns:w10="urn:schemas-microsoft-com:office:word" xmlns:w="http://schemas.openxmlformats.org/wordprocessingml/2006/main" xmlns:w14="http://schemas.microsoft.com/office/word/2010/wordml" xmlns:w15="http://schemas.microsoft.com/office/word/2012/wordml" xmlns:w16cex="http://schemas.microsoft.com/office/word/2018/wordml/cex" xmlns:w16cid="http://schemas.microsoft.com/office/word/2016/wordml/cid" xmlns:w16="http://schemas.microsoft.com/office/word/2018/wordml" xmlns:w16sdtdh="http://schemas.microsoft.com/office/word/2020/wordml/sdtdatahash" xmlns:w16se="http://schemas.microsoft.com/office/word/2015/wordml/symex" xmlns:wpg="http://schemas.microsoft.com/office/word/2010/wordprocessingGroup" xmlns:wpi="http://schemas.microsoft.com/office/word/2010/wordprocessingInk" xmlns:wne="http://schemas.microsoft.com/office/word/2006/wordml" xmlns:wps="http://schemas.microsoft.com/office/word/2010/wordprocessingShape" mc:Ignorable="w14 w15 w16se w16cid w16 w16cex w16sdtdh wp14">
+<w:hdr xmlns:wpc="http://schemas.microsoft.com/office/word/2010/wordprocessingCanvas" xmlns:mc="http://schemas.openxmlformats.org/markup-compatibility/2006" xmlns:o="urn:schemas-microsoft-com:office:office" xmlns:r="http://schemas.openxmlformats.org/officeDocument/2006/relationships" xmlns:m="http://schemas.openxmlformats.org/officeDocument/2006/math" xmlns:v="urn:schemas-microsoft-com:vml" xmlns:wp14="http://schemas.microsoft.com/office/word/2010/wordprocessingDrawing" xmlns:wp="http://schemas.openxmlformats.org/drawingml/2006/wordprocessingDrawing" xmlns:w10="urn:schemas-microsoft-com:office:word" xmlns:w="http://schemas.openxmlformats.org/wordprocessingml/2006/main" xmlns:w14="http://schemas.microsoft.com/office/word/2010/wordml" xmlns:w15="http://schemas.microsoft.com/office/word/2012/wordml" xmlns:wpg="http://schemas.microsoft.com/office/word/2010/wordprocessingGroup" xmlns:wpi="http://schemas.microsoft.com/office/word/2010/wordprocessingInk" xmlns:wne="http://schemas.microsoft.com/office/word/2006/wordml" xmlns:wps="http://schemas.microsoft.com/office/word/2010/wordprocessingShape" mc:Ignorable="w14 w15 wp14">
   <w:sdt>
     <w:sdtPr>
       <w:id w:val="1864236287"/>
@@ -6031,7 +6651,7 @@
 </file>
 
 <file path=word/header4.xml><?xml version="1.0" encoding="utf-8"?>
-<w:hdr xmlns:wpc="http://schemas.microsoft.com/office/word/2010/wordprocessingCanvas" xmlns:cx="http://schemas.microsoft.com/office/drawing/2014/chartex" xmlns:cx1="http://schemas.microsoft.com/office/drawing/2015/9/8/chartex" xmlns:cx2="http://schemas.microsoft.com/office/drawing/2015/10/21/chartex" xmlns:cx3="http://schemas.microsoft.com/office/drawing/2016/5/9/chartex" xmlns:cx4="http://schemas.microsoft.com/office/drawing/2016/5/10/chartex" xmlns:cx5="http://schemas.microsoft.com/office/drawing/2016/5/11/chartex" xmlns:cx6="http://schemas.microsoft.com/office/drawing/2016/5/12/chartex" xmlns:cx7="http://schemas.microsoft.com/office/drawing/2016/5/13/chartex" xmlns:cx8="http://schemas.microsoft.com/office/drawing/2016/5/14/chartex" xmlns:mc="http://schemas.openxmlformats.org/markup-compatibility/2006" xmlns:aink="http://schemas.microsoft.com/office/drawing/2016/ink" xmlns:am3d="http://schemas.microsoft.com/office/drawing/2017/model3d" xmlns:o="urn:schemas-microsoft-com:office:office" xmlns:oel="http://schemas.microsoft.com/office/2019/extlst" xmlns:r="http://schemas.openxmlformats.org/officeDocument/2006/relationships" xmlns:m="http://schemas.openxmlformats.org/officeDocument/2006/math" xmlns:v="urn:schemas-microsoft-com:vml" xmlns:wp14="http://schemas.microsoft.com/office/word/2010/wordprocessingDrawing" xmlns:wp="http://schemas.openxmlformats.org/drawingml/2006/wordprocessingDrawing" xmlns:w10="urn:schemas-microsoft-com:office:word" xmlns:w="http://schemas.openxmlformats.org/wordprocessingml/2006/main" xmlns:w14="http://schemas.microsoft.com/office/word/2010/wordml" xmlns:w15="http://schemas.microsoft.com/office/word/2012/wordml" xmlns:w16cex="http://schemas.microsoft.com/office/word/2018/wordml/cex" xmlns:w16cid="http://schemas.microsoft.com/office/word/2016/wordml/cid" xmlns:w16="http://schemas.microsoft.com/office/word/2018/wordml" xmlns:w16sdtdh="http://schemas.microsoft.com/office/word/2020/wordml/sdtdatahash" xmlns:w16se="http://schemas.microsoft.com/office/word/2015/wordml/symex" xmlns:wpg="http://schemas.microsoft.com/office/word/2010/wordprocessingGroup" xmlns:wpi="http://schemas.microsoft.com/office/word/2010/wordprocessingInk" xmlns:wne="http://schemas.microsoft.com/office/word/2006/wordml" xmlns:wps="http://schemas.microsoft.com/office/word/2010/wordprocessingShape" mc:Ignorable="w14 w15 w16se w16cid w16 w16cex w16sdtdh wp14">
+<w:hdr xmlns:wpc="http://schemas.microsoft.com/office/word/2010/wordprocessingCanvas" xmlns:mc="http://schemas.openxmlformats.org/markup-compatibility/2006" xmlns:o="urn:schemas-microsoft-com:office:office" xmlns:r="http://schemas.openxmlformats.org/officeDocument/2006/relationships" xmlns:m="http://schemas.openxmlformats.org/officeDocument/2006/math" xmlns:v="urn:schemas-microsoft-com:vml" xmlns:wp14="http://schemas.microsoft.com/office/word/2010/wordprocessingDrawing" xmlns:wp="http://schemas.openxmlformats.org/drawingml/2006/wordprocessingDrawing" xmlns:w10="urn:schemas-microsoft-com:office:word" xmlns:w="http://schemas.openxmlformats.org/wordprocessingml/2006/main" xmlns:w14="http://schemas.microsoft.com/office/word/2010/wordml" xmlns:w15="http://schemas.microsoft.com/office/word/2012/wordml" xmlns:wpg="http://schemas.microsoft.com/office/word/2010/wordprocessingGroup" xmlns:wpi="http://schemas.microsoft.com/office/word/2010/wordprocessingInk" xmlns:wne="http://schemas.microsoft.com/office/word/2006/wordml" xmlns:wps="http://schemas.microsoft.com/office/word/2010/wordprocessingShape" mc:Ignorable="w14 w15 wp14">
   <w:p>
     <w:pPr>
       <w:pStyle w:val="Header"/>
@@ -6041,7 +6661,7 @@
 </file>
 
 <file path=word/header5.xml><?xml version="1.0" encoding="utf-8"?>
-<w:hdr xmlns:wpc="http://schemas.microsoft.com/office/word/2010/wordprocessingCanvas" xmlns:cx="http://schemas.microsoft.com/office/drawing/2014/chartex" xmlns:cx1="http://schemas.microsoft.com/office/drawing/2015/9/8/chartex" xmlns:cx2="http://schemas.microsoft.com/office/drawing/2015/10/21/chartex" xmlns:cx3="http://schemas.microsoft.com/office/drawing/2016/5/9/chartex" xmlns:cx4="http://schemas.microsoft.com/office/drawing/2016/5/10/chartex" xmlns:cx5="http://schemas.microsoft.com/office/drawing/2016/5/11/chartex" xmlns:cx6="http://schemas.microsoft.com/office/drawing/2016/5/12/chartex" xmlns:cx7="http://schemas.microsoft.com/office/drawing/2016/5/13/chartex" xmlns:cx8="http://schemas.microsoft.com/office/drawing/2016/5/14/chartex" xmlns:mc="http://schemas.openxmlformats.org/markup-compatibility/2006" xmlns:aink="http://schemas.microsoft.com/office/drawing/2016/ink" xmlns:am3d="http://schemas.microsoft.com/office/drawing/2017/model3d" xmlns:o="urn:schemas-microsoft-com:office:office" xmlns:oel="http://schemas.microsoft.com/office/2019/extlst" xmlns:r="http://schemas.openxmlformats.org/officeDocument/2006/relationships" xmlns:m="http://schemas.openxmlformats.org/officeDocument/2006/math" xmlns:v="urn:schemas-microsoft-com:vml" xmlns:wp14="http://schemas.microsoft.com/office/word/2010/wordprocessingDrawing" xmlns:wp="http://schemas.openxmlformats.org/drawingml/2006/wordprocessingDrawing" xmlns:w10="urn:schemas-microsoft-com:office:word" xmlns:w="http://schemas.openxmlformats.org/wordprocessingml/2006/main" xmlns:w14="http://schemas.microsoft.com/office/word/2010/wordml" xmlns:w15="http://schemas.microsoft.com/office/word/2012/wordml" xmlns:w16cex="http://schemas.microsoft.com/office/word/2018/wordml/cex" xmlns:w16cid="http://schemas.microsoft.com/office/word/2016/wordml/cid" xmlns:w16="http://schemas.microsoft.com/office/word/2018/wordml" xmlns:w16sdtdh="http://schemas.microsoft.com/office/word/2020/wordml/sdtdatahash" xmlns:w16se="http://schemas.microsoft.com/office/word/2015/wordml/symex" xmlns:wpg="http://schemas.microsoft.com/office/word/2010/wordprocessingGroup" xmlns:wpi="http://schemas.microsoft.com/office/word/2010/wordprocessingInk" xmlns:wne="http://schemas.microsoft.com/office/word/2006/wordml" xmlns:wps="http://schemas.microsoft.com/office/word/2010/wordprocessingShape" mc:Ignorable="w14 w15 w16se w16cid w16 w16cex w16sdtdh wp14">
+<w:hdr xmlns:wpc="http://schemas.microsoft.com/office/word/2010/wordprocessingCanvas" xmlns:mc="http://schemas.openxmlformats.org/markup-compatibility/2006" xmlns:o="urn:schemas-microsoft-com:office:office" xmlns:r="http://schemas.openxmlformats.org/officeDocument/2006/relationships" xmlns:m="http://schemas.openxmlformats.org/officeDocument/2006/math" xmlns:v="urn:schemas-microsoft-com:vml" xmlns:wp14="http://schemas.microsoft.com/office/word/2010/wordprocessingDrawing" xmlns:wp="http://schemas.openxmlformats.org/drawingml/2006/wordprocessingDrawing" xmlns:w10="urn:schemas-microsoft-com:office:word" xmlns:w="http://schemas.openxmlformats.org/wordprocessingml/2006/main" xmlns:w14="http://schemas.microsoft.com/office/word/2010/wordml" xmlns:w15="http://schemas.microsoft.com/office/word/2012/wordml" xmlns:wpg="http://schemas.microsoft.com/office/word/2010/wordprocessingGroup" xmlns:wpi="http://schemas.microsoft.com/office/word/2010/wordprocessingInk" xmlns:wne="http://schemas.microsoft.com/office/word/2006/wordml" xmlns:wps="http://schemas.microsoft.com/office/word/2010/wordprocessingShape" mc:Ignorable="w14 w15 wp14">
   <w:sdt>
     <w:sdtPr>
       <w:id w:val="1927377425"/>
@@ -6089,7 +6709,7 @@
             <w:rStyle w:val="NomorHalamanChar"/>
             <w:noProof/>
           </w:rPr>
-          <w:t>7</w:t>
+          <w:t>12</w:t>
         </w:r>
         <w:r>
           <w:rPr>
@@ -6109,7 +6729,7 @@
 </file>
 
 <file path=word/header6.xml><?xml version="1.0" encoding="utf-8"?>
-<w:hdr xmlns:wpc="http://schemas.microsoft.com/office/word/2010/wordprocessingCanvas" xmlns:cx="http://schemas.microsoft.com/office/drawing/2014/chartex" xmlns:cx1="http://schemas.microsoft.com/office/drawing/2015/9/8/chartex" xmlns:cx2="http://schemas.microsoft.com/office/drawing/2015/10/21/chartex" xmlns:cx3="http://schemas.microsoft.com/office/drawing/2016/5/9/chartex" xmlns:cx4="http://schemas.microsoft.com/office/drawing/2016/5/10/chartex" xmlns:cx5="http://schemas.microsoft.com/office/drawing/2016/5/11/chartex" xmlns:cx6="http://schemas.microsoft.com/office/drawing/2016/5/12/chartex" xmlns:cx7="http://schemas.microsoft.com/office/drawing/2016/5/13/chartex" xmlns:cx8="http://schemas.microsoft.com/office/drawing/2016/5/14/chartex" xmlns:mc="http://schemas.openxmlformats.org/markup-compatibility/2006" xmlns:aink="http://schemas.microsoft.com/office/drawing/2016/ink" xmlns:am3d="http://schemas.microsoft.com/office/drawing/2017/model3d" xmlns:o="urn:schemas-microsoft-com:office:office" xmlns:oel="http://schemas.microsoft.com/office/2019/extlst" xmlns:r="http://schemas.openxmlformats.org/officeDocument/2006/relationships" xmlns:m="http://schemas.openxmlformats.org/officeDocument/2006/math" xmlns:v="urn:schemas-microsoft-com:vml" xmlns:wp14="http://schemas.microsoft.com/office/word/2010/wordprocessingDrawing" xmlns:wp="http://schemas.openxmlformats.org/drawingml/2006/wordprocessingDrawing" xmlns:w10="urn:schemas-microsoft-com:office:word" xmlns:w="http://schemas.openxmlformats.org/wordprocessingml/2006/main" xmlns:w14="http://schemas.microsoft.com/office/word/2010/wordml" xmlns:w15="http://schemas.microsoft.com/office/word/2012/wordml" xmlns:w16cex="http://schemas.microsoft.com/office/word/2018/wordml/cex" xmlns:w16cid="http://schemas.microsoft.com/office/word/2016/wordml/cid" xmlns:w16="http://schemas.microsoft.com/office/word/2018/wordml" xmlns:w16sdtdh="http://schemas.microsoft.com/office/word/2020/wordml/sdtdatahash" xmlns:w16se="http://schemas.microsoft.com/office/word/2015/wordml/symex" xmlns:wpg="http://schemas.microsoft.com/office/word/2010/wordprocessingGroup" xmlns:wpi="http://schemas.microsoft.com/office/word/2010/wordprocessingInk" xmlns:wne="http://schemas.microsoft.com/office/word/2006/wordml" xmlns:wps="http://schemas.microsoft.com/office/word/2010/wordprocessingShape" mc:Ignorable="w14 w15 w16se w16cid w16 w16cex w16sdtdh wp14">
+<w:hdr xmlns:wpc="http://schemas.microsoft.com/office/word/2010/wordprocessingCanvas" xmlns:mc="http://schemas.openxmlformats.org/markup-compatibility/2006" xmlns:o="urn:schemas-microsoft-com:office:office" xmlns:r="http://schemas.openxmlformats.org/officeDocument/2006/relationships" xmlns:m="http://schemas.openxmlformats.org/officeDocument/2006/math" xmlns:v="urn:schemas-microsoft-com:vml" xmlns:wp14="http://schemas.microsoft.com/office/word/2010/wordprocessingDrawing" xmlns:wp="http://schemas.openxmlformats.org/drawingml/2006/wordprocessingDrawing" xmlns:w10="urn:schemas-microsoft-com:office:word" xmlns:w="http://schemas.openxmlformats.org/wordprocessingml/2006/main" xmlns:w14="http://schemas.microsoft.com/office/word/2010/wordml" xmlns:w15="http://schemas.microsoft.com/office/word/2012/wordml" xmlns:wpg="http://schemas.microsoft.com/office/word/2010/wordprocessingGroup" xmlns:wpi="http://schemas.microsoft.com/office/word/2010/wordprocessingInk" xmlns:wne="http://schemas.microsoft.com/office/word/2006/wordml" xmlns:wps="http://schemas.microsoft.com/office/word/2010/wordprocessingShape" mc:Ignorable="w14 w15 wp14">
   <w:p>
     <w:pPr>
       <w:pStyle w:val="Header"/>
@@ -6119,7 +6739,7 @@
 </file>
 
 <file path=word/numbering.xml><?xml version="1.0" encoding="utf-8"?>
-<w:numbering xmlns:wpc="http://schemas.microsoft.com/office/word/2010/wordprocessingCanvas" xmlns:cx="http://schemas.microsoft.com/office/drawing/2014/chartex" xmlns:cx1="http://schemas.microsoft.com/office/drawing/2015/9/8/chartex" xmlns:cx2="http://schemas.microsoft.com/office/drawing/2015/10/21/chartex" xmlns:cx3="http://schemas.microsoft.com/office/drawing/2016/5/9/chartex" xmlns:cx4="http://schemas.microsoft.com/office/drawing/2016/5/10/chartex" xmlns:cx5="http://schemas.microsoft.com/office/drawing/2016/5/11/chartex" xmlns:cx6="http://schemas.microsoft.com/office/drawing/2016/5/12/chartex" xmlns:cx7="http://schemas.microsoft.com/office/drawing/2016/5/13/chartex" xmlns:cx8="http://schemas.microsoft.com/office/drawing/2016/5/14/chartex" xmlns:mc="http://schemas.openxmlformats.org/markup-compatibility/2006" xmlns:aink="http://schemas.microsoft.com/office/drawing/2016/ink" xmlns:am3d="http://schemas.microsoft.com/office/drawing/2017/model3d" xmlns:o="urn:schemas-microsoft-com:office:office" xmlns:oel="http://schemas.microsoft.com/office/2019/extlst" xmlns:r="http://schemas.openxmlformats.org/officeDocument/2006/relationships" xmlns:m="http://schemas.openxmlformats.org/officeDocument/2006/math" xmlns:v="urn:schemas-microsoft-com:vml" xmlns:wp14="http://schemas.microsoft.com/office/word/2010/wordprocessingDrawing" xmlns:wp="http://schemas.openxmlformats.org/drawingml/2006/wordprocessingDrawing" xmlns:w10="urn:schemas-microsoft-com:office:word" xmlns:w="http://schemas.openxmlformats.org/wordprocessingml/2006/main" xmlns:w14="http://schemas.microsoft.com/office/word/2010/wordml" xmlns:w15="http://schemas.microsoft.com/office/word/2012/wordml" xmlns:w16cex="http://schemas.microsoft.com/office/word/2018/wordml/cex" xmlns:w16cid="http://schemas.microsoft.com/office/word/2016/wordml/cid" xmlns:w16="http://schemas.microsoft.com/office/word/2018/wordml" xmlns:w16sdtdh="http://schemas.microsoft.com/office/word/2020/wordml/sdtdatahash" xmlns:w16se="http://schemas.microsoft.com/office/word/2015/wordml/symex" xmlns:wpg="http://schemas.microsoft.com/office/word/2010/wordprocessingGroup" xmlns:wpi="http://schemas.microsoft.com/office/word/2010/wordprocessingInk" xmlns:wne="http://schemas.microsoft.com/office/word/2006/wordml" xmlns:wps="http://schemas.microsoft.com/office/word/2010/wordprocessingShape" mc:Ignorable="w14 w15 w16se w16cid w16 w16cex w16sdtdh wp14">
+<w:numbering xmlns:wpc="http://schemas.microsoft.com/office/word/2010/wordprocessingCanvas" xmlns:mc="http://schemas.openxmlformats.org/markup-compatibility/2006" xmlns:o="urn:schemas-microsoft-com:office:office" xmlns:r="http://schemas.openxmlformats.org/officeDocument/2006/relationships" xmlns:m="http://schemas.openxmlformats.org/officeDocument/2006/math" xmlns:v="urn:schemas-microsoft-com:vml" xmlns:wp14="http://schemas.microsoft.com/office/word/2010/wordprocessingDrawing" xmlns:wp="http://schemas.openxmlformats.org/drawingml/2006/wordprocessingDrawing" xmlns:w10="urn:schemas-microsoft-com:office:word" xmlns:w="http://schemas.openxmlformats.org/wordprocessingml/2006/main" xmlns:w14="http://schemas.microsoft.com/office/word/2010/wordml" xmlns:w15="http://schemas.microsoft.com/office/word/2012/wordml" xmlns:wpg="http://schemas.microsoft.com/office/word/2010/wordprocessingGroup" xmlns:wpi="http://schemas.microsoft.com/office/word/2010/wordprocessingInk" xmlns:wne="http://schemas.microsoft.com/office/word/2006/wordml" xmlns:wps="http://schemas.microsoft.com/office/word/2010/wordprocessingShape" mc:Ignorable="w14 w15 wp14">
   <w:abstractNum w:abstractNumId="0" w15:restartNumberingAfterBreak="0">
     <w:nsid w:val="041C4605"/>
     <w:multiLevelType w:val="hybridMultilevel"/>
@@ -7316,7 +7936,7 @@
   <w:abstractNum w:abstractNumId="11" w15:restartNumberingAfterBreak="0">
     <w:nsid w:val="3DDA1371"/>
     <w:multiLevelType w:val="multilevel"/>
-    <w:tmpl w:val="2A743372"/>
+    <w:tmpl w:val="A6D49C8A"/>
     <w:lvl w:ilvl="0">
       <w:start w:val="1"/>
       <w:numFmt w:val="decimal"/>
@@ -7334,6 +7954,7 @@
     <w:lvl w:ilvl="1">
       <w:start w:val="1"/>
       <w:numFmt w:val="decimal"/>
+      <w:pStyle w:val="Heading2"/>
       <w:suff w:val="space"/>
       <w:lvlText w:val="%1.%2"/>
       <w:lvlJc w:val="left"/>
@@ -7520,7 +8141,7 @@
   <w:abstractNum w:abstractNumId="13" w15:restartNumberingAfterBreak="0">
     <w:nsid w:val="44EF5469"/>
     <w:multiLevelType w:val="multilevel"/>
-    <w:tmpl w:val="C3402434"/>
+    <w:tmpl w:val="CC72BDF4"/>
     <w:lvl w:ilvl="0">
       <w:start w:val="1"/>
       <w:numFmt w:val="decimal"/>
@@ -7537,7 +8158,6 @@
     <w:lvl w:ilvl="1">
       <w:start w:val="1"/>
       <w:numFmt w:val="decimal"/>
-      <w:pStyle w:val="Heading2"/>
       <w:suff w:val="space"/>
       <w:lvlText w:val="%1.%2"/>
       <w:lvlJc w:val="left"/>
@@ -8159,10 +8779,10 @@
       </w:pPr>
     </w:lvl>
   </w:abstractNum>
-  <w:num w:numId="1" w16cid:durableId="581377469">
+  <w:num w:numId="1">
     <w:abstractNumId w:val="16"/>
   </w:num>
-  <w:num w:numId="2" w16cid:durableId="829443455">
+  <w:num w:numId="2">
     <w:abstractNumId w:val="13"/>
     <w:lvlOverride w:ilvl="0">
       <w:lvl w:ilvl="0">
@@ -8183,7 +8803,6 @@
       <w:lvl w:ilvl="1">
         <w:start w:val="1"/>
         <w:numFmt w:val="decimal"/>
-        <w:pStyle w:val="Heading2"/>
         <w:suff w:val="space"/>
         <w:lvlText w:val="%1.%2"/>
         <w:lvlJc w:val="left"/>
@@ -8192,6 +8811,7 @@
         </w:pPr>
         <w:rPr>
           <w:rFonts w:hint="default"/>
+          <w:i w:val="0"/>
         </w:rPr>
       </w:lvl>
     </w:lvlOverride>
@@ -8296,58 +8916,58 @@
       </w:lvl>
     </w:lvlOverride>
   </w:num>
-  <w:num w:numId="3" w16cid:durableId="791284261">
+  <w:num w:numId="3">
     <w:abstractNumId w:val="11"/>
   </w:num>
-  <w:num w:numId="4" w16cid:durableId="846481219">
+  <w:num w:numId="4">
     <w:abstractNumId w:val="9"/>
   </w:num>
-  <w:num w:numId="5" w16cid:durableId="2043899057">
+  <w:num w:numId="5">
     <w:abstractNumId w:val="4"/>
   </w:num>
-  <w:num w:numId="6" w16cid:durableId="2124304035">
+  <w:num w:numId="6">
     <w:abstractNumId w:val="5"/>
   </w:num>
-  <w:num w:numId="7" w16cid:durableId="46416457">
+  <w:num w:numId="7">
     <w:abstractNumId w:val="2"/>
   </w:num>
-  <w:num w:numId="8" w16cid:durableId="1127046480">
+  <w:num w:numId="8">
     <w:abstractNumId w:val="0"/>
   </w:num>
-  <w:num w:numId="9" w16cid:durableId="2101294441">
+  <w:num w:numId="9">
     <w:abstractNumId w:val="1"/>
   </w:num>
-  <w:num w:numId="10" w16cid:durableId="346298183">
+  <w:num w:numId="10">
     <w:abstractNumId w:val="14"/>
   </w:num>
-  <w:num w:numId="11" w16cid:durableId="1172794530">
+  <w:num w:numId="11">
     <w:abstractNumId w:val="15"/>
   </w:num>
-  <w:num w:numId="12" w16cid:durableId="1804078797">
+  <w:num w:numId="12">
     <w:abstractNumId w:val="12"/>
   </w:num>
-  <w:num w:numId="13" w16cid:durableId="515317004">
+  <w:num w:numId="13">
     <w:abstractNumId w:val="10"/>
   </w:num>
-  <w:num w:numId="14" w16cid:durableId="262110531">
+  <w:num w:numId="14">
     <w:abstractNumId w:val="18"/>
   </w:num>
-  <w:num w:numId="15" w16cid:durableId="868445682">
+  <w:num w:numId="15">
     <w:abstractNumId w:val="17"/>
   </w:num>
-  <w:num w:numId="16" w16cid:durableId="1453595091">
+  <w:num w:numId="16">
     <w:abstractNumId w:val="8"/>
   </w:num>
-  <w:num w:numId="17" w16cid:durableId="1831166532">
+  <w:num w:numId="17">
     <w:abstractNumId w:val="19"/>
   </w:num>
-  <w:num w:numId="18" w16cid:durableId="782575149">
+  <w:num w:numId="18">
     <w:abstractNumId w:val="3"/>
   </w:num>
-  <w:num w:numId="19" w16cid:durableId="1302079632">
+  <w:num w:numId="19">
     <w:abstractNumId w:val="7"/>
   </w:num>
-  <w:num w:numId="20" w16cid:durableId="1715886732">
+  <w:num w:numId="20">
     <w:abstractNumId w:val="6"/>
   </w:num>
   <w:numIdMacAtCleanup w:val="19"/>
@@ -8355,7 +8975,7 @@
 </file>
 
 <file path=word/styles.xml><?xml version="1.0" encoding="utf-8"?>
-<w:styles xmlns:mc="http://schemas.openxmlformats.org/markup-compatibility/2006" xmlns:r="http://schemas.openxmlformats.org/officeDocument/2006/relationships" xmlns:w="http://schemas.openxmlformats.org/wordprocessingml/2006/main" xmlns:w14="http://schemas.microsoft.com/office/word/2010/wordml" xmlns:w15="http://schemas.microsoft.com/office/word/2012/wordml" xmlns:w16cex="http://schemas.microsoft.com/office/word/2018/wordml/cex" xmlns:w16cid="http://schemas.microsoft.com/office/word/2016/wordml/cid" xmlns:w16="http://schemas.microsoft.com/office/word/2018/wordml" xmlns:w16sdtdh="http://schemas.microsoft.com/office/word/2020/wordml/sdtdatahash" xmlns:w16se="http://schemas.microsoft.com/office/word/2015/wordml/symex" mc:Ignorable="w14 w15 w16se w16cid w16 w16cex w16sdtdh">
+<w:styles xmlns:mc="http://schemas.openxmlformats.org/markup-compatibility/2006" xmlns:r="http://schemas.openxmlformats.org/officeDocument/2006/relationships" xmlns:w="http://schemas.openxmlformats.org/wordprocessingml/2006/main" xmlns:w14="http://schemas.microsoft.com/office/word/2010/wordml" xmlns:w15="http://schemas.microsoft.com/office/word/2012/wordml" mc:Ignorable="w14 w15">
   <w:docDefaults>
     <w:rPrDefault>
       <w:rPr>
@@ -8373,7 +8993,7 @@
       </w:pPr>
     </w:pPrDefault>
   </w:docDefaults>
-  <w:latentStyles w:defLockedState="0" w:defUIPriority="99" w:defSemiHidden="0" w:defUnhideWhenUsed="0" w:defQFormat="0" w:count="376">
+  <w:latentStyles w:defLockedState="0" w:defUIPriority="99" w:defSemiHidden="0" w:defUnhideWhenUsed="0" w:defQFormat="0" w:count="371">
     <w:lsdException w:name="Normal" w:uiPriority="0" w:qFormat="1"/>
     <w:lsdException w:name="heading 1" w:uiPriority="9" w:qFormat="1"/>
     <w:lsdException w:name="heading 2" w:semiHidden="1" w:uiPriority="9" w:unhideWhenUsed="1" w:qFormat="1"/>
@@ -8745,11 +9365,6 @@
     <w:lsdException w:name="List Table 5 Dark Accent 6" w:uiPriority="50"/>
     <w:lsdException w:name="List Table 6 Colorful Accent 6" w:uiPriority="51"/>
     <w:lsdException w:name="List Table 7 Colorful Accent 6" w:uiPriority="52"/>
-    <w:lsdException w:name="Mention" w:semiHidden="1" w:unhideWhenUsed="1"/>
-    <w:lsdException w:name="Smart Hyperlink" w:semiHidden="1" w:unhideWhenUsed="1"/>
-    <w:lsdException w:name="Hashtag" w:semiHidden="1" w:unhideWhenUsed="1"/>
-    <w:lsdException w:name="Unresolved Mention" w:semiHidden="1" w:unhideWhenUsed="1"/>
-    <w:lsdException w:name="Smart Link" w:semiHidden="1" w:unhideWhenUsed="1"/>
   </w:latentStyles>
   <w:style w:type="paragraph" w:default="1" w:styleId="Normal">
     <w:name w:val="Normal"/>
@@ -8773,7 +9388,6 @@
         <w:numId w:val="3"/>
       </w:numPr>
       <w:spacing w:after="0" w:line="720" w:lineRule="auto"/>
-      <w:ind w:left="357" w:hanging="357"/>
       <w:jc w:val="center"/>
       <w:outlineLvl w:val="0"/>
     </w:pPr>
@@ -8801,10 +9415,9 @@
       <w:keepLines/>
       <w:numPr>
         <w:ilvl w:val="1"/>
-        <w:numId w:val="2"/>
+        <w:numId w:val="3"/>
       </w:numPr>
       <w:spacing w:before="120" w:after="0" w:line="360" w:lineRule="auto"/>
-      <w:ind w:left="426"/>
       <w:outlineLvl w:val="1"/>
     </w:pPr>
     <w:rPr>
@@ -8823,7 +9436,7 @@
     <w:uiPriority w:val="9"/>
     <w:unhideWhenUsed/>
     <w:qFormat/>
-    <w:rsid w:val="00C963A5"/>
+    <w:rsid w:val="002912B0"/>
     <w:pPr>
       <w:keepNext/>
       <w:keepLines/>
@@ -8832,13 +9445,13 @@
         <w:numId w:val="3"/>
       </w:numPr>
       <w:spacing w:before="120" w:after="0" w:line="360" w:lineRule="auto"/>
-      <w:ind w:left="964" w:hanging="624"/>
       <w:outlineLvl w:val="2"/>
     </w:pPr>
     <w:rPr>
       <w:rFonts w:ascii="Times New Roman" w:eastAsiaTheme="majorEastAsia" w:hAnsi="Times New Roman" w:cstheme="majorBidi"/>
       <w:sz w:val="24"/>
       <w:szCs w:val="28"/>
+      <w:lang w:val="en-US" w:eastAsia="id-ID"/>
     </w:rPr>
   </w:style>
   <w:style w:type="paragraph" w:styleId="Heading4">
@@ -8976,6 +9589,7 @@
   <w:style w:type="character" w:default="1" w:styleId="DefaultParagraphFont">
     <w:name w:val="Default Paragraph Font"/>
     <w:uiPriority w:val="1"/>
+    <w:semiHidden/>
     <w:unhideWhenUsed/>
   </w:style>
   <w:style w:type="table" w:default="1" w:styleId="TableNormal">
@@ -9033,11 +9647,12 @@
     <w:basedOn w:val="DefaultParagraphFont"/>
     <w:link w:val="Heading3"/>
     <w:uiPriority w:val="9"/>
-    <w:rsid w:val="00C963A5"/>
+    <w:rsid w:val="002912B0"/>
     <w:rPr>
       <w:rFonts w:ascii="Times New Roman" w:eastAsiaTheme="majorEastAsia" w:hAnsi="Times New Roman" w:cstheme="majorBidi"/>
       <w:sz w:val="24"/>
       <w:szCs w:val="28"/>
+      <w:lang w:val="en-US" w:eastAsia="id-ID"/>
     </w:rPr>
   </w:style>
   <w:style w:type="character" w:customStyle="1" w:styleId="Heading4Char">
@@ -9693,7 +10308,7 @@
 </file>
 
 <file path=word/glossary/document.xml><?xml version="1.0" encoding="utf-8"?>
-<w:glossaryDocument xmlns:wpc="http://schemas.microsoft.com/office/word/2010/wordprocessingCanvas" xmlns:cx="http://schemas.microsoft.com/office/drawing/2014/chartex" xmlns:cx1="http://schemas.microsoft.com/office/drawing/2015/9/8/chartex" xmlns:cx2="http://schemas.microsoft.com/office/drawing/2015/10/21/chartex" xmlns:cx3="http://schemas.microsoft.com/office/drawing/2016/5/9/chartex" xmlns:cx4="http://schemas.microsoft.com/office/drawing/2016/5/10/chartex" xmlns:cx5="http://schemas.microsoft.com/office/drawing/2016/5/11/chartex" xmlns:cx6="http://schemas.microsoft.com/office/drawing/2016/5/12/chartex" xmlns:cx7="http://schemas.microsoft.com/office/drawing/2016/5/13/chartex" xmlns:cx8="http://schemas.microsoft.com/office/drawing/2016/5/14/chartex" xmlns:mc="http://schemas.openxmlformats.org/markup-compatibility/2006" xmlns:aink="http://schemas.microsoft.com/office/drawing/2016/ink" xmlns:am3d="http://schemas.microsoft.com/office/drawing/2017/model3d" xmlns:o="urn:schemas-microsoft-com:office:office" xmlns:oel="http://schemas.microsoft.com/office/2019/extlst" xmlns:r="http://schemas.openxmlformats.org/officeDocument/2006/relationships" xmlns:m="http://schemas.openxmlformats.org/officeDocument/2006/math" xmlns:v="urn:schemas-microsoft-com:vml" xmlns:wp14="http://schemas.microsoft.com/office/word/2010/wordprocessingDrawing" xmlns:wp="http://schemas.openxmlformats.org/drawingml/2006/wordprocessingDrawing" xmlns:w10="urn:schemas-microsoft-com:office:word" xmlns:w="http://schemas.openxmlformats.org/wordprocessingml/2006/main" xmlns:w14="http://schemas.microsoft.com/office/word/2010/wordml" xmlns:w15="http://schemas.microsoft.com/office/word/2012/wordml" xmlns:w16cex="http://schemas.microsoft.com/office/word/2018/wordml/cex" xmlns:w16cid="http://schemas.microsoft.com/office/word/2016/wordml/cid" xmlns:w16="http://schemas.microsoft.com/office/word/2018/wordml" xmlns:w16sdtdh="http://schemas.microsoft.com/office/word/2020/wordml/sdtdatahash" xmlns:w16se="http://schemas.microsoft.com/office/word/2015/wordml/symex" xmlns:wpg="http://schemas.microsoft.com/office/word/2010/wordprocessingGroup" xmlns:wpi="http://schemas.microsoft.com/office/word/2010/wordprocessingInk" xmlns:wne="http://schemas.microsoft.com/office/word/2006/wordml" xmlns:wps="http://schemas.microsoft.com/office/word/2010/wordprocessingShape" mc:Ignorable="w14 w15 w16se w16cid w16 w16cex w16sdtdh wp14">
+<w:glossaryDocument xmlns:wpc="http://schemas.microsoft.com/office/word/2010/wordprocessingCanvas" xmlns:mc="http://schemas.openxmlformats.org/markup-compatibility/2006" xmlns:o="urn:schemas-microsoft-com:office:office" xmlns:r="http://schemas.openxmlformats.org/officeDocument/2006/relationships" xmlns:m="http://schemas.openxmlformats.org/officeDocument/2006/math" xmlns:v="urn:schemas-microsoft-com:vml" xmlns:wp14="http://schemas.microsoft.com/office/word/2010/wordprocessingDrawing" xmlns:wp="http://schemas.openxmlformats.org/drawingml/2006/wordprocessingDrawing" xmlns:w10="urn:schemas-microsoft-com:office:word" xmlns:w="http://schemas.openxmlformats.org/wordprocessingml/2006/main" xmlns:w14="http://schemas.microsoft.com/office/word/2010/wordml" xmlns:w15="http://schemas.microsoft.com/office/word/2012/wordml" xmlns:wpg="http://schemas.microsoft.com/office/word/2010/wordprocessingGroup" xmlns:wpi="http://schemas.microsoft.com/office/word/2010/wordprocessingInk" xmlns:wne="http://schemas.microsoft.com/office/word/2006/wordml" xmlns:wps="http://schemas.microsoft.com/office/word/2010/wordprocessingShape" mc:Ignorable="w14 w15 wp14">
   <w:docParts>
     <w:docPart>
       <w:docPartPr>
@@ -9726,7 +10341,7 @@
 </file>
 
 <file path=word/glossary/fontTable.xml><?xml version="1.0" encoding="utf-8"?>
-<w:fonts xmlns:mc="http://schemas.openxmlformats.org/markup-compatibility/2006" xmlns:r="http://schemas.openxmlformats.org/officeDocument/2006/relationships" xmlns:w="http://schemas.openxmlformats.org/wordprocessingml/2006/main" xmlns:w14="http://schemas.microsoft.com/office/word/2010/wordml" xmlns:w15="http://schemas.microsoft.com/office/word/2012/wordml" xmlns:w16cex="http://schemas.microsoft.com/office/word/2018/wordml/cex" xmlns:w16cid="http://schemas.microsoft.com/office/word/2016/wordml/cid" xmlns:w16="http://schemas.microsoft.com/office/word/2018/wordml" xmlns:w16sdtdh="http://schemas.microsoft.com/office/word/2020/wordml/sdtdatahash" xmlns:w16se="http://schemas.microsoft.com/office/word/2015/wordml/symex" mc:Ignorable="w14 w15 w16se w16cid w16 w16cex w16sdtdh">
+<w:fonts xmlns:mc="http://schemas.openxmlformats.org/markup-compatibility/2006" xmlns:r="http://schemas.openxmlformats.org/officeDocument/2006/relationships" xmlns:w="http://schemas.openxmlformats.org/wordprocessingml/2006/main" xmlns:w14="http://schemas.microsoft.com/office/word/2010/wordml" xmlns:w15="http://schemas.microsoft.com/office/word/2012/wordml" mc:Ignorable="w14 w15">
   <w:font w:name="Times New Roman">
     <w:panose1 w:val="02020603050405020304"/>
     <w:charset w:val="00"/>
@@ -9762,23 +10377,11 @@
     <w:pitch w:val="variable"/>
     <w:sig w:usb0="E4002EFF" w:usb1="C000247B" w:usb2="00000009" w:usb3="00000000" w:csb0="000001FF" w:csb1="00000000"/>
   </w:font>
-  <w:font w:name="Aptos">
-    <w:charset w:val="00"/>
-    <w:family w:val="swiss"/>
-    <w:pitch w:val="variable"/>
-    <w:sig w:usb0="20000287" w:usb1="00000003" w:usb2="00000000" w:usb3="00000000" w:csb0="0000019F" w:csb1="00000000"/>
-  </w:font>
-  <w:font w:name="Aptos Display">
-    <w:charset w:val="00"/>
-    <w:family w:val="swiss"/>
-    <w:pitch w:val="variable"/>
-    <w:sig w:usb0="20000287" w:usb1="00000003" w:usb2="00000000" w:usb3="00000000" w:csb0="0000019F" w:csb1="00000000"/>
-  </w:font>
 </w:fonts>
 </file>
 
 <file path=word/glossary/settings.xml><?xml version="1.0" encoding="utf-8"?>
-<w:settings xmlns:mc="http://schemas.openxmlformats.org/markup-compatibility/2006" xmlns:o="urn:schemas-microsoft-com:office:office" xmlns:r="http://schemas.openxmlformats.org/officeDocument/2006/relationships" xmlns:m="http://schemas.openxmlformats.org/officeDocument/2006/math" xmlns:v="urn:schemas-microsoft-com:vml" xmlns:w10="urn:schemas-microsoft-com:office:word" xmlns:w="http://schemas.openxmlformats.org/wordprocessingml/2006/main" xmlns:w14="http://schemas.microsoft.com/office/word/2010/wordml" xmlns:w15="http://schemas.microsoft.com/office/word/2012/wordml" xmlns:w16cex="http://schemas.microsoft.com/office/word/2018/wordml/cex" xmlns:w16cid="http://schemas.microsoft.com/office/word/2016/wordml/cid" xmlns:w16="http://schemas.microsoft.com/office/word/2018/wordml" xmlns:w16sdtdh="http://schemas.microsoft.com/office/word/2020/wordml/sdtdatahash" xmlns:w16se="http://schemas.microsoft.com/office/word/2015/wordml/symex" xmlns:sl="http://schemas.openxmlformats.org/schemaLibrary/2006/main" mc:Ignorable="w14 w15 w16se w16cid w16 w16cex w16sdtdh">
+<w:settings xmlns:mc="http://schemas.openxmlformats.org/markup-compatibility/2006" xmlns:o="urn:schemas-microsoft-com:office:office" xmlns:r="http://schemas.openxmlformats.org/officeDocument/2006/relationships" xmlns:m="http://schemas.openxmlformats.org/officeDocument/2006/math" xmlns:v="urn:schemas-microsoft-com:vml" xmlns:w10="urn:schemas-microsoft-com:office:word" xmlns:w="http://schemas.openxmlformats.org/wordprocessingml/2006/main" xmlns:w14="http://schemas.microsoft.com/office/word/2010/wordml" xmlns:w15="http://schemas.microsoft.com/office/word/2012/wordml" xmlns:sl="http://schemas.openxmlformats.org/schemaLibrary/2006/main" mc:Ignorable="w14 w15">
   <w:view w:val="normal"/>
   <w:defaultTabStop w:val="720"/>
   <w:characterSpacingControl w:val="doNotCompress"/>
@@ -9789,11 +10392,11 @@
     <w:compatSetting w:name="enableOpenTypeFeatures" w:uri="http://schemas.microsoft.com/office/word" w:val="1"/>
     <w:compatSetting w:name="doNotFlipMirrorIndents" w:uri="http://schemas.microsoft.com/office/word" w:val="1"/>
     <w:compatSetting w:name="differentiateMultirowTableHeaders" w:uri="http://schemas.microsoft.com/office/word" w:val="1"/>
-    <w:compatSetting w:name="useWord2013TrackBottomHyphenation" w:uri="http://schemas.microsoft.com/office/word" w:val="0"/>
   </w:compat>
   <w:rsids>
     <w:rsidRoot w:val="0002086A"/>
     <w:rsid w:val="0002086A"/>
+    <w:rsid w:val="00597CE2"/>
     <w:rsid w:val="00802268"/>
     <w:rsid w:val="009E5DEE"/>
   </w:rsids>
@@ -9812,14 +10415,14 @@
   </m:mathPr>
   <w:themeFontLang w:val="en-ID"/>
   <w:clrSchemeMapping w:bg1="light1" w:t1="dark1" w:bg2="light2" w:t2="dark2" w:accent1="accent1" w:accent2="accent2" w:accent3="accent3" w:accent4="accent4" w:accent5="accent5" w:accent6="accent6" w:hyperlink="hyperlink" w:followedHyperlink="followedHyperlink"/>
-  <w:decimalSymbol w:val=","/>
-  <w:listSeparator w:val=";"/>
+  <w:decimalSymbol w:val="."/>
+  <w:listSeparator w:val=","/>
   <w15:chartTrackingRefBased/>
 </w:settings>
 </file>
 
 <file path=word/glossary/styles.xml><?xml version="1.0" encoding="utf-8"?>
-<w:styles xmlns:mc="http://schemas.openxmlformats.org/markup-compatibility/2006" xmlns:r="http://schemas.openxmlformats.org/officeDocument/2006/relationships" xmlns:w="http://schemas.openxmlformats.org/wordprocessingml/2006/main" xmlns:w14="http://schemas.microsoft.com/office/word/2010/wordml" xmlns:w15="http://schemas.microsoft.com/office/word/2012/wordml" xmlns:w16cex="http://schemas.microsoft.com/office/word/2018/wordml/cex" xmlns:w16cid="http://schemas.microsoft.com/office/word/2016/wordml/cid" xmlns:w16="http://schemas.microsoft.com/office/word/2018/wordml" xmlns:w16sdtdh="http://schemas.microsoft.com/office/word/2020/wordml/sdtdatahash" xmlns:w16se="http://schemas.microsoft.com/office/word/2015/wordml/symex" mc:Ignorable="w14 w15 w16se w16cid w16 w16cex w16sdtdh">
+<w:styles xmlns:mc="http://schemas.openxmlformats.org/markup-compatibility/2006" xmlns:r="http://schemas.openxmlformats.org/officeDocument/2006/relationships" xmlns:w="http://schemas.openxmlformats.org/wordprocessingml/2006/main" xmlns:w14="http://schemas.microsoft.com/office/word/2010/wordml" xmlns:w15="http://schemas.microsoft.com/office/word/2012/wordml" mc:Ignorable="w14 w15">
   <w:docDefaults>
     <w:rPrDefault>
       <w:rPr>
@@ -9837,7 +10440,7 @@
       </w:pPr>
     </w:pPrDefault>
   </w:docDefaults>
-  <w:latentStyles w:defLockedState="0" w:defUIPriority="99" w:defSemiHidden="0" w:defUnhideWhenUsed="0" w:defQFormat="0" w:count="376">
+  <w:latentStyles w:defLockedState="0" w:defUIPriority="99" w:defSemiHidden="0" w:defUnhideWhenUsed="0" w:defQFormat="0" w:count="371">
     <w:lsdException w:name="Normal" w:uiPriority="0" w:qFormat="1"/>
     <w:lsdException w:name="heading 1" w:uiPriority="9" w:qFormat="1"/>
     <w:lsdException w:name="heading 2" w:semiHidden="1" w:uiPriority="9" w:unhideWhenUsed="1" w:qFormat="1"/>
@@ -10209,11 +10812,6 @@
     <w:lsdException w:name="List Table 5 Dark Accent 6" w:uiPriority="50"/>
     <w:lsdException w:name="List Table 6 Colorful Accent 6" w:uiPriority="51"/>
     <w:lsdException w:name="List Table 7 Colorful Accent 6" w:uiPriority="52"/>
-    <w:lsdException w:name="Mention" w:semiHidden="1" w:unhideWhenUsed="1"/>
-    <w:lsdException w:name="Smart Hyperlink" w:semiHidden="1" w:unhideWhenUsed="1"/>
-    <w:lsdException w:name="Hashtag" w:semiHidden="1" w:unhideWhenUsed="1"/>
-    <w:lsdException w:name="Unresolved Mention" w:semiHidden="1" w:unhideWhenUsed="1"/>
-    <w:lsdException w:name="Smart Link" w:semiHidden="1" w:unhideWhenUsed="1"/>
   </w:latentStyles>
   <w:style w:type="paragraph" w:default="1" w:styleId="Normal">
     <w:name w:val="Normal"/>
@@ -10260,7 +10858,7 @@
 </file>
 
 <file path=word/glossary/webSettings.xml><?xml version="1.0" encoding="utf-8"?>
-<w:webSettings xmlns:mc="http://schemas.openxmlformats.org/markup-compatibility/2006" xmlns:r="http://schemas.openxmlformats.org/officeDocument/2006/relationships" xmlns:w="http://schemas.openxmlformats.org/wordprocessingml/2006/main" xmlns:w14="http://schemas.microsoft.com/office/word/2010/wordml" xmlns:w15="http://schemas.microsoft.com/office/word/2012/wordml" xmlns:w16cex="http://schemas.microsoft.com/office/word/2018/wordml/cex" xmlns:w16cid="http://schemas.microsoft.com/office/word/2016/wordml/cid" xmlns:w16="http://schemas.microsoft.com/office/word/2018/wordml" xmlns:w16sdtdh="http://schemas.microsoft.com/office/word/2020/wordml/sdtdatahash" xmlns:w16se="http://schemas.microsoft.com/office/word/2015/wordml/symex" mc:Ignorable="w14 w15 w16se w16cid w16 w16cex w16sdtdh">
+<w:webSettings xmlns:mc="http://schemas.openxmlformats.org/markup-compatibility/2006" xmlns:r="http://schemas.openxmlformats.org/officeDocument/2006/relationships" xmlns:w="http://schemas.openxmlformats.org/wordprocessingml/2006/main" xmlns:w14="http://schemas.microsoft.com/office/word/2010/wordml" xmlns:w15="http://schemas.microsoft.com/office/word/2012/wordml" mc:Ignorable="w14 w15">
   <w:optimizeForBrowser/>
   <w:allowPNG/>
 </w:webSettings>
@@ -10591,7 +11189,7 @@
 </file>
 
 <file path=customXml/itemProps1.xml><?xml version="1.0" encoding="utf-8"?>
-<ds:datastoreItem xmlns:ds="http://schemas.openxmlformats.org/officeDocument/2006/customXml" ds:itemID="{11F025F6-A2EB-47C1-B317-EFD6F33181AE}">
+<ds:datastoreItem xmlns:ds="http://schemas.openxmlformats.org/officeDocument/2006/customXml" ds:itemID="{369997C6-DFDD-4962-90F0-28BFC2F0661F}">
   <ds:schemaRefs>
     <ds:schemaRef ds:uri="http://schemas.openxmlformats.org/officeDocument/2006/bibliography"/>
   </ds:schemaRefs>

</xml_diff>